<commit_message>
Enrichit les livrables : diagrammes rendus en PNG et dossiers détaillés
- Rendu des 10 diagrammes UML/Merise en PNG (docs/diagrammes/render.py
  via mermaid.ink et plantuml.com) dans docs/diagrammes/images/.
- Mémoire (Dossier Projet) fortement étoffé (~1060 paragraphes) :
  cas d'utilisation détaillés, dictionnaire de données, normalisation,
  endpoints API, mapping OWASP Top 10, gestion de projet agile,
  plan de tests, veille, glossaire, extraits de code et diagrammes intégrés.
- Dossier Professionnel enrichi (code + diagrammes par activité-type).
- PowerPoint : ajout de slides de diagrammes (19 slides).
- Nouveau document de présentation du projet pour l'encadrant.
</commit_message>
<xml_diff>
--- a/livrables/Dossier_Professionnel_CDA.docx
+++ b/livrables/Dossier_Professionnel_CDA.docx
@@ -11,7 +11,7 @@
         <w:rPr>
           <w:b/>
           <w:bCs/>
-          <w:color w:val="2F59C2"/>
+          <w:color w:val="0B5394"/>
           <w:sz w:val="40"/>
           <w:szCs w:val="40"/>
         </w:rPr>
@@ -20,7 +20,7 @@
     </w:p>
     <w:p>
       <w:pPr>
-        <w:spacing w:after="600"/>
+        <w:spacing w:after="500"/>
         <w:jc w:val="center"/>
       </w:pPr>
       <w:r>
@@ -34,7 +34,7 @@
     </w:p>
     <w:p>
       <w:pPr>
-        <w:spacing w:after="120"/>
+        <w:spacing w:after="100"/>
         <w:jc w:val="center"/>
       </w:pPr>
       <w:r>
@@ -92,7 +92,7 @@
               <w:bottom w:val="single" w:color="B7C3D0" w:sz="1"/>
               <w:right w:val="single" w:color="B7C3D0" w:sz="1"/>
             </w:tcBorders>
-            <w:shd w:fill="2F59C2" w:val="clear"/>
+            <w:shd w:fill="0B5394" w:val="clear"/>
             <w:tcMar>
               <w:top w:type="dxa" w:w="80"/>
               <w:left w:type="dxa" w:w="120"/>
@@ -106,6 +106,8 @@
                 <w:b/>
                 <w:bCs/>
                 <w:color w:val="FFFFFF"/>
+                <w:sz w:val="20"/>
+                <w:szCs w:val="20"/>
               </w:rPr>
               <w:t xml:space="preserve">Rubrique</w:t>
             </w:r>
@@ -120,7 +122,7 @@
               <w:bottom w:val="single" w:color="B7C3D0" w:sz="1"/>
               <w:right w:val="single" w:color="B7C3D0" w:sz="1"/>
             </w:tcBorders>
-            <w:shd w:fill="2F59C2" w:val="clear"/>
+            <w:shd w:fill="0B5394" w:val="clear"/>
             <w:tcMar>
               <w:top w:type="dxa" w:w="80"/>
               <w:left w:type="dxa" w:w="120"/>
@@ -134,6 +136,8 @@
                 <w:b/>
                 <w:bCs/>
                 <w:color w:val="FFFFFF"/>
+                <w:sz w:val="20"/>
+                <w:szCs w:val="20"/>
               </w:rPr>
               <w:t xml:space="preserve">Information</w:t>
             </w:r>
@@ -160,8 +164,8 @@
           <w:p>
             <w:r>
               <w:rPr>
-                <w:sz w:val="20"/>
-                <w:szCs w:val="20"/>
+                <w:sz w:val="19"/>
+                <w:szCs w:val="19"/>
               </w:rPr>
               <w:t xml:space="preserve">Nom et prénom</w:t>
             </w:r>
@@ -186,8 +190,8 @@
           <w:p>
             <w:r>
               <w:rPr>
-                <w:sz w:val="20"/>
-                <w:szCs w:val="20"/>
+                <w:sz w:val="19"/>
+                <w:szCs w:val="19"/>
               </w:rPr>
               <w:t xml:space="preserve">[À COMPLÉTER]</w:t>
             </w:r>
@@ -214,8 +218,8 @@
           <w:p>
             <w:r>
               <w:rPr>
-                <w:sz w:val="20"/>
-                <w:szCs w:val="20"/>
+                <w:sz w:val="19"/>
+                <w:szCs w:val="19"/>
               </w:rPr>
               <w:t xml:space="preserve">Date de naissance</w:t>
             </w:r>
@@ -240,8 +244,8 @@
           <w:p>
             <w:r>
               <w:rPr>
-                <w:sz w:val="20"/>
-                <w:szCs w:val="20"/>
+                <w:sz w:val="19"/>
+                <w:szCs w:val="19"/>
               </w:rPr>
               <w:t xml:space="preserve">[À COMPLÉTER]</w:t>
             </w:r>
@@ -268,8 +272,8 @@
           <w:p>
             <w:r>
               <w:rPr>
-                <w:sz w:val="20"/>
-                <w:szCs w:val="20"/>
+                <w:sz w:val="19"/>
+                <w:szCs w:val="19"/>
               </w:rPr>
               <w:t xml:space="preserve">Centre de formation</w:t>
             </w:r>
@@ -294,8 +298,8 @@
           <w:p>
             <w:r>
               <w:rPr>
-                <w:sz w:val="20"/>
-                <w:szCs w:val="20"/>
+                <w:sz w:val="19"/>
+                <w:szCs w:val="19"/>
               </w:rPr>
               <w:t xml:space="preserve">ESTIAM</w:t>
             </w:r>
@@ -322,8 +326,8 @@
           <w:p>
             <w:r>
               <w:rPr>
-                <w:sz w:val="20"/>
-                <w:szCs w:val="20"/>
+                <w:sz w:val="19"/>
+                <w:szCs w:val="19"/>
               </w:rPr>
               <w:t xml:space="preserve">Session d'examen</w:t>
             </w:r>
@@ -348,8 +352,8 @@
           <w:p>
             <w:r>
               <w:rPr>
-                <w:sz w:val="20"/>
-                <w:szCs w:val="20"/>
+                <w:sz w:val="19"/>
+                <w:szCs w:val="19"/>
               </w:rPr>
               <w:t xml:space="preserve">Septembre 2026</w:t>
             </w:r>
@@ -376,8 +380,8 @@
           <w:p>
             <w:r>
               <w:rPr>
-                <w:sz w:val="20"/>
-                <w:szCs w:val="20"/>
+                <w:sz w:val="19"/>
+                <w:szCs w:val="19"/>
               </w:rPr>
               <w:t xml:space="preserve">Projet support</w:t>
             </w:r>
@@ -402,8 +406,8 @@
           <w:p>
             <w:r>
               <w:rPr>
-                <w:sz w:val="20"/>
-                <w:szCs w:val="20"/>
+                <w:sz w:val="19"/>
+                <w:szCs w:val="19"/>
               </w:rPr>
               <w:t xml:space="preserve">CongésFlow — Application de gestion des congés</w:t>
             </w:r>
@@ -413,7 +417,7 @@
     </w:tbl>
     <w:p>
       <w:pPr>
-        <w:spacing w:before="500"/>
+        <w:spacing w:before="400"/>
         <w:jc w:val="center"/>
       </w:pPr>
       <w:r>
@@ -487,7 +491,7 @@
           <w:iCs/>
           <w:color w:val="B3267A"/>
         </w:rPr>
-        <w:t xml:space="preserve">[À COMPLÉTER : présentez en quelques lignes votre parcours, votre projet professionnel et le contexte de réalisation du projet — formation à l'ESTIAM, éventuel stage/alternance.]</w:t>
+        <w:t xml:space="preserve">[À COMPLÉTER : présentez votre parcours, votre projet professionnel et le contexte de réalisation du projet — formation à l'ESTIAM, éventuel stage ou alternance.]</w:t>
       </w:r>
     </w:p>
     <w:p>
@@ -503,9 +507,423 @@
         <w:spacing w:after="120"/>
       </w:pPr>
       <w:r>
-        <w:t xml:space="preserve">Le projet CongésFlow a été réalisé en centre de formation. Il s'agit d'une application web de gestion des demandes de congés destinée à une PME, permettant à un salarié de poser une demande, à son manager de la valider, et au service RH de piloter les soldes. Ce projet a servi de support à la mise en œuvre des compétences des trois activités-types du titre.</w:t>
-      </w:r>
-    </w:p>
+        <w:t xml:space="preserve">Le projet CongésFlow a été réalisé en centre de formation. Il s'agit d'une application web de gestion des demandes de congés destinée à une PME : un salarié pose une demande, son manager la valide ou la refuse, et le service RH pilote les soldes. Ce projet a servi de support à la mise en œuvre des compétences des trois activités-types du titre, depuis la conception jusqu'au déploiement conteneurisé.</w:t>
+      </w:r>
+    </w:p>
+    <w:p>
+      <w:pPr>
+        <w:pStyle w:val="Heading2"/>
+      </w:pPr>
+      <w:r>
+        <w:t xml:space="preserve">Environnement technique</w:t>
+      </w:r>
+    </w:p>
+    <w:tbl>
+      <w:tblPr>
+        <w:tblW w:type="dxa" w:w="9026"/>
+        <w:tblBorders>
+          <w:top w:val="single" w:color="auto" w:sz="4"/>
+          <w:left w:val="single" w:color="auto" w:sz="4"/>
+          <w:bottom w:val="single" w:color="auto" w:sz="4"/>
+          <w:right w:val="single" w:color="auto" w:sz="4"/>
+          <w:insideH w:val="single" w:color="auto" w:sz="4"/>
+          <w:insideV w:val="single" w:color="auto" w:sz="4"/>
+        </w:tblBorders>
+      </w:tblPr>
+      <w:tblGrid>
+        <w:gridCol w:w="2400"/>
+        <w:gridCol w:w="6626"/>
+      </w:tblGrid>
+      <w:tr>
+        <w:trPr>
+          <w:tblHeader/>
+        </w:trPr>
+        <w:tc>
+          <w:tcPr>
+            <w:tcW w:type="dxa" w:w="2400"/>
+            <w:tcBorders>
+              <w:top w:val="single" w:color="B7C3D0" w:sz="1"/>
+              <w:left w:val="single" w:color="B7C3D0" w:sz="1"/>
+              <w:bottom w:val="single" w:color="B7C3D0" w:sz="1"/>
+              <w:right w:val="single" w:color="B7C3D0" w:sz="1"/>
+            </w:tcBorders>
+            <w:shd w:fill="0B5394" w:val="clear"/>
+            <w:tcMar>
+              <w:top w:type="dxa" w:w="80"/>
+              <w:left w:type="dxa" w:w="120"/>
+              <w:bottom w:type="dxa" w:w="80"/>
+              <w:right w:type="dxa" w:w="120"/>
+            </w:tcMar>
+          </w:tcPr>
+          <w:p>
+            <w:r>
+              <w:rPr>
+                <w:b/>
+                <w:bCs/>
+                <w:color w:val="FFFFFF"/>
+                <w:sz w:val="20"/>
+                <w:szCs w:val="20"/>
+              </w:rPr>
+              <w:t xml:space="preserve">Domaine</w:t>
+            </w:r>
+          </w:p>
+        </w:tc>
+        <w:tc>
+          <w:tcPr>
+            <w:tcW w:type="dxa" w:w="6626"/>
+            <w:tcBorders>
+              <w:top w:val="single" w:color="B7C3D0" w:sz="1"/>
+              <w:left w:val="single" w:color="B7C3D0" w:sz="1"/>
+              <w:bottom w:val="single" w:color="B7C3D0" w:sz="1"/>
+              <w:right w:val="single" w:color="B7C3D0" w:sz="1"/>
+            </w:tcBorders>
+            <w:shd w:fill="0B5394" w:val="clear"/>
+            <w:tcMar>
+              <w:top w:type="dxa" w:w="80"/>
+              <w:left w:type="dxa" w:w="120"/>
+              <w:bottom w:type="dxa" w:w="80"/>
+              <w:right w:type="dxa" w:w="120"/>
+            </w:tcMar>
+          </w:tcPr>
+          <w:p>
+            <w:r>
+              <w:rPr>
+                <w:b/>
+                <w:bCs/>
+                <w:color w:val="FFFFFF"/>
+                <w:sz w:val="20"/>
+                <w:szCs w:val="20"/>
+              </w:rPr>
+              <w:t xml:space="preserve">Technologies / outils</w:t>
+            </w:r>
+          </w:p>
+        </w:tc>
+      </w:tr>
+      <w:tr>
+        <w:tc>
+          <w:tcPr>
+            <w:tcW w:type="dxa" w:w="2400"/>
+            <w:tcBorders>
+              <w:top w:val="single" w:color="B7C3D0" w:sz="1"/>
+              <w:left w:val="single" w:color="B7C3D0" w:sz="1"/>
+              <w:bottom w:val="single" w:color="B7C3D0" w:sz="1"/>
+              <w:right w:val="single" w:color="B7C3D0" w:sz="1"/>
+            </w:tcBorders>
+            <w:tcMar>
+              <w:top w:type="dxa" w:w="80"/>
+              <w:left w:type="dxa" w:w="120"/>
+              <w:bottom w:type="dxa" w:w="80"/>
+              <w:right w:type="dxa" w:w="120"/>
+            </w:tcMar>
+          </w:tcPr>
+          <w:p>
+            <w:r>
+              <w:rPr>
+                <w:sz w:val="19"/>
+                <w:szCs w:val="19"/>
+              </w:rPr>
+              <w:t xml:space="preserve">Front-end</w:t>
+            </w:r>
+          </w:p>
+        </w:tc>
+        <w:tc>
+          <w:tcPr>
+            <w:tcW w:type="dxa" w:w="6626"/>
+            <w:tcBorders>
+              <w:top w:val="single" w:color="B7C3D0" w:sz="1"/>
+              <w:left w:val="single" w:color="B7C3D0" w:sz="1"/>
+              <w:bottom w:val="single" w:color="B7C3D0" w:sz="1"/>
+              <w:right w:val="single" w:color="B7C3D0" w:sz="1"/>
+            </w:tcBorders>
+            <w:tcMar>
+              <w:top w:type="dxa" w:w="80"/>
+              <w:left w:type="dxa" w:w="120"/>
+              <w:bottom w:type="dxa" w:w="80"/>
+              <w:right w:type="dxa" w:w="120"/>
+            </w:tcMar>
+          </w:tcPr>
+          <w:p>
+            <w:r>
+              <w:rPr>
+                <w:sz w:val="19"/>
+                <w:szCs w:val="19"/>
+              </w:rPr>
+              <w:t xml:space="preserve">React, TypeScript, Vite, Tailwind CSS, React Query, Axios</w:t>
+            </w:r>
+          </w:p>
+        </w:tc>
+      </w:tr>
+      <w:tr>
+        <w:tc>
+          <w:tcPr>
+            <w:tcW w:type="dxa" w:w="2400"/>
+            <w:tcBorders>
+              <w:top w:val="single" w:color="B7C3D0" w:sz="1"/>
+              <w:left w:val="single" w:color="B7C3D0" w:sz="1"/>
+              <w:bottom w:val="single" w:color="B7C3D0" w:sz="1"/>
+              <w:right w:val="single" w:color="B7C3D0" w:sz="1"/>
+            </w:tcBorders>
+            <w:tcMar>
+              <w:top w:type="dxa" w:w="80"/>
+              <w:left w:type="dxa" w:w="120"/>
+              <w:bottom w:type="dxa" w:w="80"/>
+              <w:right w:type="dxa" w:w="120"/>
+            </w:tcMar>
+          </w:tcPr>
+          <w:p>
+            <w:r>
+              <w:rPr>
+                <w:sz w:val="19"/>
+                <w:szCs w:val="19"/>
+              </w:rPr>
+              <w:t xml:space="preserve">Back-end</w:t>
+            </w:r>
+          </w:p>
+        </w:tc>
+        <w:tc>
+          <w:tcPr>
+            <w:tcW w:type="dxa" w:w="6626"/>
+            <w:tcBorders>
+              <w:top w:val="single" w:color="B7C3D0" w:sz="1"/>
+              <w:left w:val="single" w:color="B7C3D0" w:sz="1"/>
+              <w:bottom w:val="single" w:color="B7C3D0" w:sz="1"/>
+              <w:right w:val="single" w:color="B7C3D0" w:sz="1"/>
+            </w:tcBorders>
+            <w:tcMar>
+              <w:top w:type="dxa" w:w="80"/>
+              <w:left w:type="dxa" w:w="120"/>
+              <w:bottom w:type="dxa" w:w="80"/>
+              <w:right w:type="dxa" w:w="120"/>
+            </w:tcMar>
+          </w:tcPr>
+          <w:p>
+            <w:r>
+              <w:rPr>
+                <w:sz w:val="19"/>
+                <w:szCs w:val="19"/>
+              </w:rPr>
+              <w:t xml:space="preserve">Python, FastAPI, SQLAlchemy, Pydantic</w:t>
+            </w:r>
+          </w:p>
+        </w:tc>
+      </w:tr>
+      <w:tr>
+        <w:tc>
+          <w:tcPr>
+            <w:tcW w:type="dxa" w:w="2400"/>
+            <w:tcBorders>
+              <w:top w:val="single" w:color="B7C3D0" w:sz="1"/>
+              <w:left w:val="single" w:color="B7C3D0" w:sz="1"/>
+              <w:bottom w:val="single" w:color="B7C3D0" w:sz="1"/>
+              <w:right w:val="single" w:color="B7C3D0" w:sz="1"/>
+            </w:tcBorders>
+            <w:tcMar>
+              <w:top w:type="dxa" w:w="80"/>
+              <w:left w:type="dxa" w:w="120"/>
+              <w:bottom w:type="dxa" w:w="80"/>
+              <w:right w:type="dxa" w:w="120"/>
+            </w:tcMar>
+          </w:tcPr>
+          <w:p>
+            <w:r>
+              <w:rPr>
+                <w:sz w:val="19"/>
+                <w:szCs w:val="19"/>
+              </w:rPr>
+              <w:t xml:space="preserve">Base de données</w:t>
+            </w:r>
+          </w:p>
+        </w:tc>
+        <w:tc>
+          <w:tcPr>
+            <w:tcW w:type="dxa" w:w="6626"/>
+            <w:tcBorders>
+              <w:top w:val="single" w:color="B7C3D0" w:sz="1"/>
+              <w:left w:val="single" w:color="B7C3D0" w:sz="1"/>
+              <w:bottom w:val="single" w:color="B7C3D0" w:sz="1"/>
+              <w:right w:val="single" w:color="B7C3D0" w:sz="1"/>
+            </w:tcBorders>
+            <w:tcMar>
+              <w:top w:type="dxa" w:w="80"/>
+              <w:left w:type="dxa" w:w="120"/>
+              <w:bottom w:type="dxa" w:w="80"/>
+              <w:right w:type="dxa" w:w="120"/>
+            </w:tcMar>
+          </w:tcPr>
+          <w:p>
+            <w:r>
+              <w:rPr>
+                <w:sz w:val="19"/>
+                <w:szCs w:val="19"/>
+              </w:rPr>
+              <w:t xml:space="preserve">PostgreSQL (SQLite pour les tests)</w:t>
+            </w:r>
+          </w:p>
+        </w:tc>
+      </w:tr>
+      <w:tr>
+        <w:tc>
+          <w:tcPr>
+            <w:tcW w:type="dxa" w:w="2400"/>
+            <w:tcBorders>
+              <w:top w:val="single" w:color="B7C3D0" w:sz="1"/>
+              <w:left w:val="single" w:color="B7C3D0" w:sz="1"/>
+              <w:bottom w:val="single" w:color="B7C3D0" w:sz="1"/>
+              <w:right w:val="single" w:color="B7C3D0" w:sz="1"/>
+            </w:tcBorders>
+            <w:tcMar>
+              <w:top w:type="dxa" w:w="80"/>
+              <w:left w:type="dxa" w:w="120"/>
+              <w:bottom w:type="dxa" w:w="80"/>
+              <w:right w:type="dxa" w:w="120"/>
+            </w:tcMar>
+          </w:tcPr>
+          <w:p>
+            <w:r>
+              <w:rPr>
+                <w:sz w:val="19"/>
+                <w:szCs w:val="19"/>
+              </w:rPr>
+              <w:t xml:space="preserve">Sécurité</w:t>
+            </w:r>
+          </w:p>
+        </w:tc>
+        <w:tc>
+          <w:tcPr>
+            <w:tcW w:type="dxa" w:w="6626"/>
+            <w:tcBorders>
+              <w:top w:val="single" w:color="B7C3D0" w:sz="1"/>
+              <w:left w:val="single" w:color="B7C3D0" w:sz="1"/>
+              <w:bottom w:val="single" w:color="B7C3D0" w:sz="1"/>
+              <w:right w:val="single" w:color="B7C3D0" w:sz="1"/>
+            </w:tcBorders>
+            <w:tcMar>
+              <w:top w:type="dxa" w:w="80"/>
+              <w:left w:type="dxa" w:w="120"/>
+              <w:bottom w:type="dxa" w:w="80"/>
+              <w:right w:type="dxa" w:w="120"/>
+            </w:tcMar>
+          </w:tcPr>
+          <w:p>
+            <w:r>
+              <w:rPr>
+                <w:sz w:val="19"/>
+                <w:szCs w:val="19"/>
+              </w:rPr>
+              <w:t xml:space="preserve">JWT (python-jose), bcrypt (passlib), RBAC</w:t>
+            </w:r>
+          </w:p>
+        </w:tc>
+      </w:tr>
+      <w:tr>
+        <w:tc>
+          <w:tcPr>
+            <w:tcW w:type="dxa" w:w="2400"/>
+            <w:tcBorders>
+              <w:top w:val="single" w:color="B7C3D0" w:sz="1"/>
+              <w:left w:val="single" w:color="B7C3D0" w:sz="1"/>
+              <w:bottom w:val="single" w:color="B7C3D0" w:sz="1"/>
+              <w:right w:val="single" w:color="B7C3D0" w:sz="1"/>
+            </w:tcBorders>
+            <w:tcMar>
+              <w:top w:type="dxa" w:w="80"/>
+              <w:left w:type="dxa" w:w="120"/>
+              <w:bottom w:type="dxa" w:w="80"/>
+              <w:right w:type="dxa" w:w="120"/>
+            </w:tcMar>
+          </w:tcPr>
+          <w:p>
+            <w:r>
+              <w:rPr>
+                <w:sz w:val="19"/>
+                <w:szCs w:val="19"/>
+              </w:rPr>
+              <w:t xml:space="preserve">Tests</w:t>
+            </w:r>
+          </w:p>
+        </w:tc>
+        <w:tc>
+          <w:tcPr>
+            <w:tcW w:type="dxa" w:w="6626"/>
+            <w:tcBorders>
+              <w:top w:val="single" w:color="B7C3D0" w:sz="1"/>
+              <w:left w:val="single" w:color="B7C3D0" w:sz="1"/>
+              <w:bottom w:val="single" w:color="B7C3D0" w:sz="1"/>
+              <w:right w:val="single" w:color="B7C3D0" w:sz="1"/>
+            </w:tcBorders>
+            <w:tcMar>
+              <w:top w:type="dxa" w:w="80"/>
+              <w:left w:type="dxa" w:w="120"/>
+              <w:bottom w:type="dxa" w:w="80"/>
+              <w:right w:type="dxa" w:w="120"/>
+            </w:tcMar>
+          </w:tcPr>
+          <w:p>
+            <w:r>
+              <w:rPr>
+                <w:sz w:val="19"/>
+                <w:szCs w:val="19"/>
+              </w:rPr>
+              <w:t xml:space="preserve">pytest, httpx, Vitest</w:t>
+            </w:r>
+          </w:p>
+        </w:tc>
+      </w:tr>
+      <w:tr>
+        <w:tc>
+          <w:tcPr>
+            <w:tcW w:type="dxa" w:w="2400"/>
+            <w:tcBorders>
+              <w:top w:val="single" w:color="B7C3D0" w:sz="1"/>
+              <w:left w:val="single" w:color="B7C3D0" w:sz="1"/>
+              <w:bottom w:val="single" w:color="B7C3D0" w:sz="1"/>
+              <w:right w:val="single" w:color="B7C3D0" w:sz="1"/>
+            </w:tcBorders>
+            <w:tcMar>
+              <w:top w:type="dxa" w:w="80"/>
+              <w:left w:type="dxa" w:w="120"/>
+              <w:bottom w:type="dxa" w:w="80"/>
+              <w:right w:type="dxa" w:w="120"/>
+            </w:tcMar>
+          </w:tcPr>
+          <w:p>
+            <w:r>
+              <w:rPr>
+                <w:sz w:val="19"/>
+                <w:szCs w:val="19"/>
+              </w:rPr>
+              <w:t xml:space="preserve">DevOps / outils</w:t>
+            </w:r>
+          </w:p>
+        </w:tc>
+        <w:tc>
+          <w:tcPr>
+            <w:tcW w:type="dxa" w:w="6626"/>
+            <w:tcBorders>
+              <w:top w:val="single" w:color="B7C3D0" w:sz="1"/>
+              <w:left w:val="single" w:color="B7C3D0" w:sz="1"/>
+              <w:bottom w:val="single" w:color="B7C3D0" w:sz="1"/>
+              <w:right w:val="single" w:color="B7C3D0" w:sz="1"/>
+            </w:tcBorders>
+            <w:tcMar>
+              <w:top w:type="dxa" w:w="80"/>
+              <w:left w:type="dxa" w:w="120"/>
+              <w:bottom w:type="dxa" w:w="80"/>
+              <w:right w:type="dxa" w:w="120"/>
+            </w:tcMar>
+          </w:tcPr>
+          <w:p>
+            <w:r>
+              <w:rPr>
+                <w:sz w:val="19"/>
+                <w:szCs w:val="19"/>
+              </w:rPr>
+              <w:t xml:space="preserve">Git, GitHub, Docker, docker-compose, GitHub Actions, VS Code</w:t>
+            </w:r>
+          </w:p>
+        </w:tc>
+      </w:tr>
+    </w:tbl>
     <w:p>
       <w:r>
         <w:br w:type="page"/>
@@ -524,7 +942,7 @@
         <w:spacing w:after="120"/>
       </w:pPr>
       <w:r>
-        <w:t xml:space="preserve">Le titre CDA est constitué de trois activités-types (AT). Le tableau ci-dessous récapitule la couverture par le projet CongésFlow.</w:t>
+        <w:t xml:space="preserve">Le titre CDA est constitué de trois activités-types (AT). Le tableau ci-dessous récapitule leur couverture par le projet CongésFlow.</w:t>
       </w:r>
     </w:p>
     <w:tbl>
@@ -556,7 +974,7 @@
               <w:bottom w:val="single" w:color="B7C3D0" w:sz="1"/>
               <w:right w:val="single" w:color="B7C3D0" w:sz="1"/>
             </w:tcBorders>
-            <w:shd w:fill="2F59C2" w:val="clear"/>
+            <w:shd w:fill="0B5394" w:val="clear"/>
             <w:tcMar>
               <w:top w:type="dxa" w:w="80"/>
               <w:left w:type="dxa" w:w="120"/>
@@ -570,6 +988,8 @@
                 <w:b/>
                 <w:bCs/>
                 <w:color w:val="FFFFFF"/>
+                <w:sz w:val="20"/>
+                <w:szCs w:val="20"/>
               </w:rPr>
               <w:t xml:space="preserve">Activité-type</w:t>
             </w:r>
@@ -584,7 +1004,7 @@
               <w:bottom w:val="single" w:color="B7C3D0" w:sz="1"/>
               <w:right w:val="single" w:color="B7C3D0" w:sz="1"/>
             </w:tcBorders>
-            <w:shd w:fill="2F59C2" w:val="clear"/>
+            <w:shd w:fill="0B5394" w:val="clear"/>
             <w:tcMar>
               <w:top w:type="dxa" w:w="80"/>
               <w:left w:type="dxa" w:w="120"/>
@@ -598,6 +1018,8 @@
                 <w:b/>
                 <w:bCs/>
                 <w:color w:val="FFFFFF"/>
+                <w:sz w:val="20"/>
+                <w:szCs w:val="20"/>
               </w:rPr>
               <w:t xml:space="preserve">Couverture par CongésFlow</w:t>
             </w:r>
@@ -624,8 +1046,8 @@
           <w:p>
             <w:r>
               <w:rPr>
-                <w:sz w:val="20"/>
-                <w:szCs w:val="20"/>
+                <w:sz w:val="19"/>
+                <w:szCs w:val="19"/>
               </w:rPr>
               <w:t xml:space="preserve">AT1 — Développer une interface utilisateur sécurisée (front-end)</w:t>
             </w:r>
@@ -650,10 +1072,10 @@
           <w:p>
             <w:r>
               <w:rPr>
-                <w:sz w:val="20"/>
-                <w:szCs w:val="20"/>
-              </w:rPr>
-              <w:t xml:space="preserve">Maquettes Figma, SPA React/TypeScript, routes protégées, consommation d'API REST</w:t>
+                <w:sz w:val="19"/>
+                <w:szCs w:val="19"/>
+              </w:rPr>
+              <w:t xml:space="preserve">Maquettes Figma, SPA React/TypeScript, routes protégées par rôle, consommation d'API REST</w:t>
             </w:r>
           </w:p>
         </w:tc>
@@ -678,8 +1100,8 @@
           <w:p>
             <w:r>
               <w:rPr>
-                <w:sz w:val="20"/>
-                <w:szCs w:val="20"/>
+                <w:sz w:val="19"/>
+                <w:szCs w:val="19"/>
               </w:rPr>
               <w:t xml:space="preserve">AT2 — Concevoir et développer la persistance des données</w:t>
             </w:r>
@@ -704,8 +1126,8 @@
           <w:p>
             <w:r>
               <w:rPr>
-                <w:sz w:val="20"/>
-                <w:szCs w:val="20"/>
+                <w:sz w:val="19"/>
+                <w:szCs w:val="19"/>
               </w:rPr>
               <w:t xml:space="preserve">MCD/MLD/MPD, PostgreSQL, ORM SQLAlchemy, script SQL, contraintes d'intégrité</w:t>
             </w:r>
@@ -732,8 +1154,8 @@
           <w:p>
             <w:r>
               <w:rPr>
-                <w:sz w:val="20"/>
-                <w:szCs w:val="20"/>
+                <w:sz w:val="19"/>
+                <w:szCs w:val="19"/>
               </w:rPr>
               <w:t xml:space="preserve">AT3 — Concevoir et développer une application multicouche sécurisée</w:t>
             </w:r>
@@ -758,8 +1180,8 @@
           <w:p>
             <w:r>
               <w:rPr>
-                <w:sz w:val="20"/>
-                <w:szCs w:val="20"/>
+                <w:sz w:val="19"/>
+                <w:szCs w:val="19"/>
               </w:rPr>
               <w:t xml:space="preserve">API FastAPI, architecture en couches, JWT/RBAC, tests, Docker, CI/CD, gestion agile</w:t>
             </w:r>
@@ -782,7 +1204,69 @@
     </w:p>
     <w:p>
       <w:pPr>
-        <w:pStyle w:val="Heading2"/>
+        <w:spacing w:after="40" w:before="80"/>
+        <w:jc w:val="center"/>
+      </w:pPr>
+      <w:r>
+        <w:drawing>
+          <wp:inline distT="0" distB="0" distL="0" distR="0">
+            <wp:extent cx="3562350" cy="3048000"/>
+            <wp:effectExtent t="0" r="0" b="0" l="0"/>
+            <wp:docPr id="1" name="02-cas-utilisation" descr="Diagramme de cas d'utilisation" title="Fig.2"/>
+            <wp:cNvGraphicFramePr>
+              <a:graphicFrameLocks xmlns:a="http://schemas.openxmlformats.org/drawingml/2006/main" noChangeAspect="1"/>
+            </wp:cNvGraphicFramePr>
+            <a:graphic xmlns:a="http://schemas.openxmlformats.org/drawingml/2006/main">
+              <a:graphicData uri="http://schemas.openxmlformats.org/drawingml/2006/picture">
+                <pic:pic xmlns:pic="http://schemas.openxmlformats.org/drawingml/2006/picture">
+                  <pic:nvPicPr>
+                    <pic:cNvPr id="0" name="" descr=""/>
+                    <pic:cNvPicPr>
+                      <a:picLocks noChangeAspect="1" noChangeArrowheads="1"/>
+                    </pic:cNvPicPr>
+                  </pic:nvPicPr>
+                  <pic:blipFill>
+                    <a:blip r:embed="rId8" cstate="none"/>
+                    <a:srcRect/>
+                    <a:stretch>
+                      <a:fillRect/>
+                    </a:stretch>
+                  </pic:blipFill>
+                  <pic:spPr bwMode="auto">
+                    <a:xfrm>
+                      <a:off x="0" y="0"/>
+                      <a:ext cx="3562350" cy="3048000"/>
+                    </a:xfrm>
+                    <a:prstGeom prst="rect">
+                      <a:avLst/>
+                    </a:prstGeom>
+                  </pic:spPr>
+                </pic:pic>
+              </a:graphicData>
+            </a:graphic>
+          </wp:inline>
+        </w:drawing>
+      </w:r>
+    </w:p>
+    <w:p>
+      <w:pPr>
+        <w:spacing w:after="140"/>
+        <w:jc w:val="center"/>
+      </w:pPr>
+      <w:r>
+        <w:rPr>
+          <w:i/>
+          <w:iCs/>
+          <w:color w:val="44505F"/>
+          <w:sz w:val="18"/>
+          <w:szCs w:val="18"/>
+        </w:rPr>
+        <w:t xml:space="preserve">Fig.2 — Diagramme de cas d'utilisation</w:t>
+      </w:r>
+    </w:p>
+    <w:p>
+      <w:pPr>
+        <w:pStyle w:val="Heading3"/>
       </w:pPr>
       <w:r>
         <w:t xml:space="preserve">3.1 Exemple — Conception et développement de l'interface de CongésFlow</w:t>
@@ -809,7 +1293,7 @@
         <w:spacing w:after="120"/>
       </w:pPr>
       <w:r>
-        <w:t xml:space="preserve">À partir de l'expression des besoins, j'ai d'abord maquetté les écrans clés sous Figma (connexion, tableau de bord, validation), puis développé l'interface en React et TypeScript. L'enjeu de sécurité était de n'exposer chaque écran qu'aux rôles autorisés et de gérer le jeton d'authentification côté client.</w:t>
+        <w:t xml:space="preserve">À partir de l'expression des besoins, j'ai d'abord maquetté les écrans clés sous Figma (connexion, tableau de bord, validation), puis développé l'interface en React et TypeScript. L'enjeu de sécurité était de n'exposer chaque écran qu'aux rôles autorisés et de gérer correctement le jeton d'authentification côté client.</w:t>
       </w:r>
     </w:p>
     <w:p>
@@ -835,10 +1319,10 @@
           <w:ilvl w:val="0"/>
           <w:numId w:val="2"/>
         </w:numPr>
-        <w:spacing w:after="60"/>
-      </w:pPr>
-      <w:r>
-        <w:t xml:space="preserve">Réalisation des maquettes Figma et définition du parcours utilisateur.</w:t>
+        <w:spacing w:after="50"/>
+      </w:pPr>
+      <w:r>
+        <w:t xml:space="preserve">Réalisation des maquettes Figma et définition du parcours utilisateur (moins de trois clics pour poser une demande).</w:t>
       </w:r>
     </w:p>
     <w:p>
@@ -848,10 +1332,10 @@
           <w:ilvl w:val="0"/>
           <w:numId w:val="2"/>
         </w:numPr>
-        <w:spacing w:after="60"/>
-      </w:pPr>
-      <w:r>
-        <w:t xml:space="preserve">Développement de composants React réutilisables (formulaire de demande, badges de statut, mise en page responsive avec Tailwind CSS).</w:t>
+        <w:spacing w:after="50"/>
+      </w:pPr>
+      <w:r>
+        <w:t xml:space="preserve">Initialisation du projet front avec Vite, TypeScript et Tailwind CSS.</w:t>
       </w:r>
     </w:p>
     <w:p>
@@ -861,10 +1345,10 @@
           <w:ilvl w:val="0"/>
           <w:numId w:val="2"/>
         </w:numPr>
-        <w:spacing w:after="60"/>
-      </w:pPr>
-      <w:r>
-        <w:t xml:space="preserve">Mise en place de la gestion d'état serveur avec React Query et de la consommation de l'API REST via Axios.</w:t>
+        <w:spacing w:after="50"/>
+      </w:pPr>
+      <w:r>
+        <w:t xml:space="preserve">Développement de composants React réutilisables (formulaire de demande, badges de statut, mise en page responsive).</w:t>
       </w:r>
     </w:p>
     <w:p>
@@ -874,26 +1358,10 @@
           <w:ilvl w:val="0"/>
           <w:numId w:val="2"/>
         </w:numPr>
-        <w:spacing w:after="60"/>
-      </w:pPr>
-      <w:r>
-        <w:t xml:space="preserve">Sécurisation côté client : routes protégées par rôle (RBAC), stockage et injection du JWT, déconnexion automatique en cas de jeton invalide.</w:t>
-      </w:r>
-    </w:p>
-    <w:p>
-      <w:pPr>
-        <w:spacing w:after="120"/>
-        <w:rPr>
-          <w:b/>
-          <w:bCs/>
-        </w:rPr>
-      </w:pPr>
-      <w:r>
-        <w:rPr>
-          <w:b/>
-          <w:bCs/>
-        </w:rPr>
-        <w:t xml:space="preserve">Compétences mises en œuvre :</w:t>
+        <w:spacing w:after="50"/>
+      </w:pPr>
+      <w:r>
+        <w:t xml:space="preserve">Mise en place de la gestion d'état serveur avec React Query et de la consommation de l'API REST via Axios.</w:t>
       </w:r>
     </w:p>
     <w:p>
@@ -903,10 +1371,26 @@
           <w:ilvl w:val="0"/>
           <w:numId w:val="2"/>
         </w:numPr>
-        <w:spacing w:after="60"/>
-      </w:pPr>
-      <w:r>
-        <w:t xml:space="preserve">Maquetter une application.</w:t>
+        <w:spacing w:after="50"/>
+      </w:pPr>
+      <w:r>
+        <w:t xml:space="preserve">Sécurisation côté client : injection automatique du jeton JWT, déconnexion sur réponse 401, routes protégées par rôle.</w:t>
+      </w:r>
+    </w:p>
+    <w:p>
+      <w:pPr>
+        <w:spacing w:after="120"/>
+        <w:rPr>
+          <w:b/>
+          <w:bCs/>
+        </w:rPr>
+      </w:pPr>
+      <w:r>
+        <w:rPr>
+          <w:b/>
+          <w:bCs/>
+        </w:rPr>
+        <w:t xml:space="preserve">Compétences mises en œuvre :</w:t>
       </w:r>
     </w:p>
     <w:p>
@@ -916,10 +1400,10 @@
           <w:ilvl w:val="0"/>
           <w:numId w:val="2"/>
         </w:numPr>
-        <w:spacing w:after="60"/>
-      </w:pPr>
-      <w:r>
-        <w:t xml:space="preserve">Développer la partie front-end d'une interface utilisateur web.</w:t>
+        <w:spacing w:after="50"/>
+      </w:pPr>
+      <w:r>
+        <w:t xml:space="preserve">Maquetter une application.</w:t>
       </w:r>
     </w:p>
     <w:p>
@@ -929,84 +1413,10 @@
           <w:ilvl w:val="0"/>
           <w:numId w:val="2"/>
         </w:numPr>
-        <w:spacing w:after="60"/>
-      </w:pPr>
-      <w:r>
-        <w:t xml:space="preserve">Développer des composants d'accès aux données (consommation d'API REST).</w:t>
-      </w:r>
-    </w:p>
-    <w:p>
-      <w:pPr>
-        <w:spacing w:after="120"/>
-      </w:pPr>
-      <w:r>
-        <w:rPr>
-          <w:i/>
-          <w:iCs/>
-          <w:color w:val="B3267A"/>
-        </w:rPr>
-        <w:t xml:space="preserve">[À COMPLÉTER éventuellement : ajoutez une difficulté concrète rencontrée sur le front et la manière dont vous l'avez résolue — ex. configuration CORS, gestion de l'expiration du token.]</w:t>
-      </w:r>
-    </w:p>
-    <w:p>
-      <w:r>
-        <w:br w:type="page"/>
-      </w:r>
-    </w:p>
-    <w:p>
-      <w:pPr>
-        <w:pStyle w:val="Heading1"/>
-      </w:pPr>
-      <w:r>
-        <w:t xml:space="preserve">4. Activité-type 2 — Concevoir et développer la persistance des données</w:t>
-      </w:r>
-    </w:p>
-    <w:p>
-      <w:pPr>
-        <w:pStyle w:val="Heading2"/>
-      </w:pPr>
-      <w:r>
-        <w:t xml:space="preserve">4.1 Exemple — Modélisation et mise en place de la base de données</w:t>
-      </w:r>
-    </w:p>
-    <w:p>
-      <w:pPr>
-        <w:spacing w:after="120"/>
-        <w:rPr>
-          <w:b/>
-          <w:bCs/>
-        </w:rPr>
-      </w:pPr>
-      <w:r>
-        <w:rPr>
-          <w:b/>
-          <w:bCs/>
-        </w:rPr>
-        <w:t xml:space="preserve">Contexte et description de la situation professionnelle :</w:t>
-      </w:r>
-    </w:p>
-    <w:p>
-      <w:pPr>
-        <w:spacing w:after="120"/>
-      </w:pPr>
-      <w:r>
-        <w:t xml:space="preserve">Le cœur de CongésFlow repose sur des données relationnelles (employés, demandes, soldes, types d'absence). J'ai conduit la modélisation depuis le besoin métier jusqu'au modèle physique exécutable, en garantissant l'intégrité des données.</w:t>
-      </w:r>
-    </w:p>
-    <w:p>
-      <w:pPr>
-        <w:spacing w:after="120"/>
-        <w:rPr>
-          <w:b/>
-          <w:bCs/>
-        </w:rPr>
-      </w:pPr>
-      <w:r>
-        <w:rPr>
-          <w:b/>
-          <w:bCs/>
-        </w:rPr>
-        <w:t xml:space="preserve">Actions réalisées :</w:t>
+        <w:spacing w:after="50"/>
+      </w:pPr>
+      <w:r>
+        <w:t xml:space="preserve">Développer la partie front-end d'une interface utilisateur web.</w:t>
       </w:r>
     </w:p>
     <w:p>
@@ -1016,10 +1426,514 @@
           <w:ilvl w:val="0"/>
           <w:numId w:val="2"/>
         </w:numPr>
-        <w:spacing w:after="60"/>
-      </w:pPr>
-      <w:r>
-        <w:t xml:space="preserve">Élaboration du modèle conceptuel (MCD) puis du modèle logique (MLD) en identifiant entités, relations et cardinalités.</w:t>
+        <w:spacing w:after="50"/>
+      </w:pPr>
+      <w:r>
+        <w:t xml:space="preserve">Développer des composants d'accès aux données (consommation d'API REST).</w:t>
+      </w:r>
+    </w:p>
+    <w:p>
+      <w:pPr>
+        <w:pStyle w:val="Heading3"/>
+      </w:pPr>
+      <w:r>
+        <w:t xml:space="preserve">Réalisations techniques concrètes</w:t>
+      </w:r>
+    </w:p>
+    <w:p>
+      <w:pPr>
+        <w:spacing w:after="120"/>
+        <w:rPr>
+          <w:b/>
+          <w:bCs/>
+        </w:rPr>
+      </w:pPr>
+      <w:r>
+        <w:rPr>
+          <w:b/>
+          <w:bCs/>
+        </w:rPr>
+        <w:t xml:space="preserve">Installation et démarrage de l'environnement front-end :</w:t>
+      </w:r>
+    </w:p>
+    <w:p>
+      <w:pPr>
+        <w:spacing w:after="40" w:before="60"/>
+      </w:pPr>
+      <w:r>
+        <w:rPr>
+          <w:b/>
+          <w:bCs/>
+          <w:color w:val="0B5394"/>
+          <w:sz w:val="18"/>
+          <w:szCs w:val="18"/>
+        </w:rPr>
+        <w:t xml:space="preserve">Terminal — front-end</w:t>
+      </w:r>
+    </w:p>
+    <w:tbl>
+      <w:tblPr>
+        <w:tblW w:type="dxa" w:w="9026"/>
+        <w:tblBorders>
+          <w:top w:val="single" w:color="auto" w:sz="4"/>
+          <w:left w:val="single" w:color="auto" w:sz="4"/>
+          <w:bottom w:val="single" w:color="auto" w:sz="4"/>
+          <w:right w:val="single" w:color="auto" w:sz="4"/>
+          <w:insideH w:val="single" w:color="auto" w:sz="4"/>
+          <w:insideV w:val="single" w:color="auto" w:sz="4"/>
+        </w:tblBorders>
+      </w:tblPr>
+      <w:tblGrid>
+        <w:gridCol w:w="9026"/>
+      </w:tblGrid>
+      <w:tr>
+        <w:tc>
+          <w:tcPr>
+            <w:tcW w:type="dxa" w:w="9026"/>
+            <w:tcBorders>
+              <w:top w:val="single" w:color="D6DEE6" w:sz="1"/>
+              <w:left w:val="single" w:color="0B5394" w:sz="4"/>
+              <w:bottom w:val="single" w:color="D6DEE6" w:sz="1"/>
+              <w:right w:val="single" w:color="D6DEE6" w:sz="1"/>
+            </w:tcBorders>
+            <w:shd w:fill="F6F8FA" w:val="clear"/>
+            <w:tcMar>
+              <w:top w:type="dxa" w:w="120"/>
+              <w:left w:type="dxa" w:w="160"/>
+              <w:bottom w:type="dxa" w:w="120"/>
+              <w:right w:type="dxa" w:w="120"/>
+            </w:tcMar>
+          </w:tcPr>
+          <w:p>
+            <w:pPr>
+              <w:spacing w:after="0" w:line="230" w:lineRule="auto"/>
+            </w:pPr>
+            <w:r>
+              <w:rPr>
+                <w:rFonts w:ascii="Courier New" w:cs="Courier New" w:eastAsia="Courier New" w:hAnsi="Courier New"/>
+                <w:color w:val="1B2A3A"/>
+                <w:sz w:val="16"/>
+                <w:szCs w:val="16"/>
+              </w:rPr>
+              <w:t xml:space="preserve">cd frontend</w:t>
+            </w:r>
+          </w:p>
+          <w:p>
+            <w:pPr>
+              <w:spacing w:after="0" w:line="230" w:lineRule="auto"/>
+            </w:pPr>
+            <w:r>
+              <w:rPr>
+                <w:rFonts w:ascii="Courier New" w:cs="Courier New" w:eastAsia="Courier New" w:hAnsi="Courier New"/>
+                <w:color w:val="1B2A3A"/>
+                <w:sz w:val="16"/>
+                <w:szCs w:val="16"/>
+              </w:rPr>
+              <w:t xml:space="preserve">npm install        # installe React, TypeScript, Tailwind, etc.</w:t>
+            </w:r>
+          </w:p>
+          <w:p>
+            <w:pPr>
+              <w:spacing w:after="0" w:line="230" w:lineRule="auto"/>
+            </w:pPr>
+            <w:r>
+              <w:rPr>
+                <w:rFonts w:ascii="Courier New" w:cs="Courier New" w:eastAsia="Courier New" w:hAnsi="Courier New"/>
+                <w:color w:val="1B2A3A"/>
+                <w:sz w:val="16"/>
+                <w:szCs w:val="16"/>
+              </w:rPr>
+              <w:t xml:space="preserve">npm run dev        # démarre le serveur de développement (port 5173)</w:t>
+            </w:r>
+          </w:p>
+        </w:tc>
+      </w:tr>
+    </w:tbl>
+    <w:p>
+      <w:pPr>
+        <w:spacing w:after="120"/>
+      </w:pPr>
+    </w:p>
+    <w:p>
+      <w:pPr>
+        <w:spacing w:after="120"/>
+        <w:rPr>
+          <w:b/>
+          <w:bCs/>
+        </w:rPr>
+      </w:pPr>
+      <w:r>
+        <w:rPr>
+          <w:b/>
+          <w:bCs/>
+        </w:rPr>
+        <w:t xml:space="preserve">Protection des routes selon l'authentification et le rôle (RBAC côté client) :</w:t>
+      </w:r>
+    </w:p>
+    <w:p>
+      <w:pPr>
+        <w:spacing w:after="40" w:before="60"/>
+      </w:pPr>
+      <w:r>
+        <w:rPr>
+          <w:b/>
+          <w:bCs/>
+          <w:color w:val="0B5394"/>
+          <w:sz w:val="18"/>
+          <w:szCs w:val="18"/>
+        </w:rPr>
+        <w:t xml:space="preserve">frontend/src/components/ProtectedRoute.tsx (extrait)</w:t>
+      </w:r>
+    </w:p>
+    <w:tbl>
+      <w:tblPr>
+        <w:tblW w:type="dxa" w:w="9026"/>
+        <w:tblBorders>
+          <w:top w:val="single" w:color="auto" w:sz="4"/>
+          <w:left w:val="single" w:color="auto" w:sz="4"/>
+          <w:bottom w:val="single" w:color="auto" w:sz="4"/>
+          <w:right w:val="single" w:color="auto" w:sz="4"/>
+          <w:insideH w:val="single" w:color="auto" w:sz="4"/>
+          <w:insideV w:val="single" w:color="auto" w:sz="4"/>
+        </w:tblBorders>
+      </w:tblPr>
+      <w:tblGrid>
+        <w:gridCol w:w="9026"/>
+      </w:tblGrid>
+      <w:tr>
+        <w:tc>
+          <w:tcPr>
+            <w:tcW w:type="dxa" w:w="9026"/>
+            <w:tcBorders>
+              <w:top w:val="single" w:color="D6DEE6" w:sz="1"/>
+              <w:left w:val="single" w:color="0B5394" w:sz="4"/>
+              <w:bottom w:val="single" w:color="D6DEE6" w:sz="1"/>
+              <w:right w:val="single" w:color="D6DEE6" w:sz="1"/>
+            </w:tcBorders>
+            <w:shd w:fill="F6F8FA" w:val="clear"/>
+            <w:tcMar>
+              <w:top w:type="dxa" w:w="120"/>
+              <w:left w:type="dxa" w:w="160"/>
+              <w:bottom w:type="dxa" w:w="120"/>
+              <w:right w:type="dxa" w:w="120"/>
+            </w:tcMar>
+          </w:tcPr>
+          <w:p>
+            <w:pPr>
+              <w:spacing w:after="0" w:line="230" w:lineRule="auto"/>
+            </w:pPr>
+            <w:r>
+              <w:rPr>
+                <w:rFonts w:ascii="Courier New" w:cs="Courier New" w:eastAsia="Courier New" w:hAnsi="Courier New"/>
+                <w:color w:val="1B2A3A"/>
+                <w:sz w:val="16"/>
+                <w:szCs w:val="16"/>
+              </w:rPr>
+              <w:t xml:space="preserve">export default function ProtectedRoute({ children, roles }) {</w:t>
+            </w:r>
+          </w:p>
+          <w:p>
+            <w:pPr>
+              <w:spacing w:after="0" w:line="230" w:lineRule="auto"/>
+            </w:pPr>
+            <w:r>
+              <w:rPr>
+                <w:rFonts w:ascii="Courier New" w:cs="Courier New" w:eastAsia="Courier New" w:hAnsi="Courier New"/>
+                <w:color w:val="1B2A3A"/>
+                <w:sz w:val="16"/>
+                <w:szCs w:val="16"/>
+              </w:rPr>
+              <w:t xml:space="preserve">  const { user, loading } = useAuth();</w:t>
+            </w:r>
+          </w:p>
+          <w:p>
+            <w:pPr>
+              <w:spacing w:after="0" w:line="230" w:lineRule="auto"/>
+            </w:pPr>
+            <w:r>
+              <w:rPr>
+                <w:rFonts w:ascii="Courier New" w:cs="Courier New" w:eastAsia="Courier New" w:hAnsi="Courier New"/>
+                <w:color w:val="1B2A3A"/>
+                <w:sz w:val="16"/>
+                <w:szCs w:val="16"/>
+              </w:rPr>
+              <w:t xml:space="preserve">  if (loading) return &lt;div&gt;Chargement…&lt;/div&gt;;</w:t>
+            </w:r>
+          </w:p>
+          <w:p>
+            <w:pPr>
+              <w:spacing w:after="0" w:line="230" w:lineRule="auto"/>
+            </w:pPr>
+            <w:r>
+              <w:rPr>
+                <w:rFonts w:ascii="Courier New" w:cs="Courier New" w:eastAsia="Courier New" w:hAnsi="Courier New"/>
+                <w:color w:val="1B2A3A"/>
+                <w:sz w:val="16"/>
+                <w:szCs w:val="16"/>
+              </w:rPr>
+              <w:t xml:space="preserve">  if (!user) return &lt;Navigate to="/login" replace /&gt;;</w:t>
+            </w:r>
+          </w:p>
+          <w:p>
+            <w:pPr>
+              <w:spacing w:after="0" w:line="230" w:lineRule="auto"/>
+            </w:pPr>
+            <w:r>
+              <w:rPr>
+                <w:rFonts w:ascii="Courier New" w:cs="Courier New" w:eastAsia="Courier New" w:hAnsi="Courier New"/>
+                <w:color w:val="1B2A3A"/>
+                <w:sz w:val="16"/>
+                <w:szCs w:val="16"/>
+              </w:rPr>
+              <w:t xml:space="preserve">  if (roles &amp;&amp; !roles.includes(user.role))</w:t>
+            </w:r>
+          </w:p>
+          <w:p>
+            <w:pPr>
+              <w:spacing w:after="0" w:line="230" w:lineRule="auto"/>
+            </w:pPr>
+            <w:r>
+              <w:rPr>
+                <w:rFonts w:ascii="Courier New" w:cs="Courier New" w:eastAsia="Courier New" w:hAnsi="Courier New"/>
+                <w:color w:val="1B2A3A"/>
+                <w:sz w:val="16"/>
+                <w:szCs w:val="16"/>
+              </w:rPr>
+              <w:t xml:space="preserve">    return &lt;Navigate to="/" replace /&gt;;</w:t>
+            </w:r>
+          </w:p>
+          <w:p>
+            <w:pPr>
+              <w:spacing w:after="0" w:line="230" w:lineRule="auto"/>
+            </w:pPr>
+            <w:r>
+              <w:rPr>
+                <w:rFonts w:ascii="Courier New" w:cs="Courier New" w:eastAsia="Courier New" w:hAnsi="Courier New"/>
+                <w:color w:val="1B2A3A"/>
+                <w:sz w:val="16"/>
+                <w:szCs w:val="16"/>
+              </w:rPr>
+              <w:t xml:space="preserve">  return children;</w:t>
+            </w:r>
+          </w:p>
+          <w:p>
+            <w:pPr>
+              <w:spacing w:after="0" w:line="230" w:lineRule="auto"/>
+            </w:pPr>
+            <w:r>
+              <w:rPr>
+                <w:rFonts w:ascii="Courier New" w:cs="Courier New" w:eastAsia="Courier New" w:hAnsi="Courier New"/>
+                <w:color w:val="1B2A3A"/>
+                <w:sz w:val="16"/>
+                <w:szCs w:val="16"/>
+              </w:rPr>
+              <w:t xml:space="preserve">}</w:t>
+            </w:r>
+          </w:p>
+        </w:tc>
+      </w:tr>
+    </w:tbl>
+    <w:p>
+      <w:pPr>
+        <w:spacing w:after="120"/>
+      </w:pPr>
+    </w:p>
+    <w:p>
+      <w:pPr>
+        <w:spacing w:after="120"/>
+      </w:pPr>
+      <w:r>
+        <w:rPr>
+          <w:i/>
+          <w:iCs/>
+          <w:color w:val="B3267A"/>
+        </w:rPr>
+        <w:t xml:space="preserve">[À COMPLÉTER éventuellement : ajoutez une difficulté concrète rencontrée sur le front et la manière dont vous l'avez résolue.]</w:t>
+      </w:r>
+    </w:p>
+    <w:p>
+      <w:r>
+        <w:br w:type="page"/>
+      </w:r>
+    </w:p>
+    <w:p>
+      <w:pPr>
+        <w:pStyle w:val="Heading1"/>
+      </w:pPr>
+      <w:r>
+        <w:t xml:space="preserve">4. Activité-type 2 — Concevoir et développer la persistance des données</w:t>
+      </w:r>
+    </w:p>
+    <w:p>
+      <w:pPr>
+        <w:spacing w:after="40" w:before="80"/>
+        <w:jc w:val="center"/>
+      </w:pPr>
+      <w:r>
+        <w:drawing>
+          <wp:inline distT="0" distB="0" distL="0" distR="0">
+            <wp:extent cx="2028825" cy="3048000"/>
+            <wp:effectExtent t="0" r="0" b="0" l="0"/>
+            <wp:docPr id="1" name="07-mcd" descr="Modèle conceptuel de données (MCD)" title="Fig.7"/>
+            <wp:cNvGraphicFramePr>
+              <a:graphicFrameLocks xmlns:a="http://schemas.openxmlformats.org/drawingml/2006/main" noChangeAspect="1"/>
+            </wp:cNvGraphicFramePr>
+            <a:graphic xmlns:a="http://schemas.openxmlformats.org/drawingml/2006/main">
+              <a:graphicData uri="http://schemas.openxmlformats.org/drawingml/2006/picture">
+                <pic:pic xmlns:pic="http://schemas.openxmlformats.org/drawingml/2006/picture">
+                  <pic:nvPicPr>
+                    <pic:cNvPr id="0" name="" descr=""/>
+                    <pic:cNvPicPr>
+                      <a:picLocks noChangeAspect="1" noChangeArrowheads="1"/>
+                    </pic:cNvPicPr>
+                  </pic:nvPicPr>
+                  <pic:blipFill>
+                    <a:blip r:embed="rId9" cstate="none"/>
+                    <a:srcRect/>
+                    <a:stretch>
+                      <a:fillRect/>
+                    </a:stretch>
+                  </pic:blipFill>
+                  <pic:spPr bwMode="auto">
+                    <a:xfrm>
+                      <a:off x="0" y="0"/>
+                      <a:ext cx="2028825" cy="3048000"/>
+                    </a:xfrm>
+                    <a:prstGeom prst="rect">
+                      <a:avLst/>
+                    </a:prstGeom>
+                  </pic:spPr>
+                </pic:pic>
+              </a:graphicData>
+            </a:graphic>
+          </wp:inline>
+        </w:drawing>
+      </w:r>
+    </w:p>
+    <w:p>
+      <w:pPr>
+        <w:spacing w:after="140"/>
+        <w:jc w:val="center"/>
+      </w:pPr>
+      <w:r>
+        <w:rPr>
+          <w:i/>
+          <w:iCs/>
+          <w:color w:val="44505F"/>
+          <w:sz w:val="18"/>
+          <w:szCs w:val="18"/>
+        </w:rPr>
+        <w:t xml:space="preserve">Fig.7 — Modèle conceptuel de données (MCD)</w:t>
+      </w:r>
+    </w:p>
+    <w:p>
+      <w:pPr>
+        <w:spacing w:after="40" w:before="80"/>
+        <w:jc w:val="center"/>
+      </w:pPr>
+      <w:r>
+        <w:drawing>
+          <wp:inline distT="0" distB="0" distL="0" distR="0">
+            <wp:extent cx="2447925" cy="3048000"/>
+            <wp:effectExtent t="0" r="0" b="0" l="0"/>
+            <wp:docPr id="1" name="06-classes" descr="Diagramme de classes" title="Fig.6"/>
+            <wp:cNvGraphicFramePr>
+              <a:graphicFrameLocks xmlns:a="http://schemas.openxmlformats.org/drawingml/2006/main" noChangeAspect="1"/>
+            </wp:cNvGraphicFramePr>
+            <a:graphic xmlns:a="http://schemas.openxmlformats.org/drawingml/2006/main">
+              <a:graphicData uri="http://schemas.openxmlformats.org/drawingml/2006/picture">
+                <pic:pic xmlns:pic="http://schemas.openxmlformats.org/drawingml/2006/picture">
+                  <pic:nvPicPr>
+                    <pic:cNvPr id="0" name="" descr=""/>
+                    <pic:cNvPicPr>
+                      <a:picLocks noChangeAspect="1" noChangeArrowheads="1"/>
+                    </pic:cNvPicPr>
+                  </pic:nvPicPr>
+                  <pic:blipFill>
+                    <a:blip r:embed="rId10" cstate="none"/>
+                    <a:srcRect/>
+                    <a:stretch>
+                      <a:fillRect/>
+                    </a:stretch>
+                  </pic:blipFill>
+                  <pic:spPr bwMode="auto">
+                    <a:xfrm>
+                      <a:off x="0" y="0"/>
+                      <a:ext cx="2447925" cy="3048000"/>
+                    </a:xfrm>
+                    <a:prstGeom prst="rect">
+                      <a:avLst/>
+                    </a:prstGeom>
+                  </pic:spPr>
+                </pic:pic>
+              </a:graphicData>
+            </a:graphic>
+          </wp:inline>
+        </w:drawing>
+      </w:r>
+    </w:p>
+    <w:p>
+      <w:pPr>
+        <w:spacing w:after="140"/>
+        <w:jc w:val="center"/>
+      </w:pPr>
+      <w:r>
+        <w:rPr>
+          <w:i/>
+          <w:iCs/>
+          <w:color w:val="44505F"/>
+          <w:sz w:val="18"/>
+          <w:szCs w:val="18"/>
+        </w:rPr>
+        <w:t xml:space="preserve">Fig.6 — Diagramme de classes</w:t>
+      </w:r>
+    </w:p>
+    <w:p>
+      <w:pPr>
+        <w:pStyle w:val="Heading3"/>
+      </w:pPr>
+      <w:r>
+        <w:t xml:space="preserve">4.1 Exemple — Modélisation et mise en place de la base de données</w:t>
+      </w:r>
+    </w:p>
+    <w:p>
+      <w:pPr>
+        <w:spacing w:after="120"/>
+        <w:rPr>
+          <w:b/>
+          <w:bCs/>
+        </w:rPr>
+      </w:pPr>
+      <w:r>
+        <w:rPr>
+          <w:b/>
+          <w:bCs/>
+        </w:rPr>
+        <w:t xml:space="preserve">Contexte et description de la situation professionnelle :</w:t>
+      </w:r>
+    </w:p>
+    <w:p>
+      <w:pPr>
+        <w:spacing w:after="120"/>
+      </w:pPr>
+      <w:r>
+        <w:t xml:space="preserve">Le cœur de CongésFlow repose sur des données relationnelles (employés, demandes, soldes, types d'absence). J'ai conduit la modélisation depuis le besoin métier jusqu'au modèle physique exécutable, en garantissant l'intégrité des données.</w:t>
+      </w:r>
+    </w:p>
+    <w:p>
+      <w:pPr>
+        <w:spacing w:after="120"/>
+        <w:rPr>
+          <w:b/>
+          <w:bCs/>
+        </w:rPr>
+      </w:pPr>
+      <w:r>
+        <w:rPr>
+          <w:b/>
+          <w:bCs/>
+        </w:rPr>
+        <w:t xml:space="preserve">Actions réalisées :</w:t>
       </w:r>
     </w:p>
     <w:p>
@@ -1029,10 +1943,10 @@
           <w:ilvl w:val="0"/>
           <w:numId w:val="2"/>
         </w:numPr>
-        <w:spacing w:after="60"/>
-      </w:pPr>
-      <w:r>
-        <w:t xml:space="preserve">Écriture du modèle physique en SQL pour PostgreSQL (tables, clés primaires et étrangères, contraintes UNIQUE / NOT NULL / CHECK, index).</w:t>
+        <w:spacing w:after="50"/>
+      </w:pPr>
+      <w:r>
+        <w:t xml:space="preserve">Élaboration du modèle conceptuel (MCD) puis logique (MLD) : entités, relations et cardinalités.</w:t>
       </w:r>
     </w:p>
     <w:p>
@@ -1042,10 +1956,10 @@
           <w:ilvl w:val="0"/>
           <w:numId w:val="2"/>
         </w:numPr>
-        <w:spacing w:after="60"/>
-      </w:pPr>
-      <w:r>
-        <w:t xml:space="preserve">Mise en place de l'accès aux données via l'ORM SQLAlchemy, garantissant des requêtes préparées (protection contre les injections SQL).</w:t>
+        <w:spacing w:after="50"/>
+      </w:pPr>
+      <w:r>
+        <w:t xml:space="preserve">Écriture du modèle physique en SQL pour PostgreSQL (clés primaires/étrangères, contraintes UNIQUE / NOT NULL / CHECK, index).</w:t>
       </w:r>
     </w:p>
     <w:p>
@@ -1055,26 +1969,10 @@
           <w:ilvl w:val="0"/>
           <w:numId w:val="2"/>
         </w:numPr>
-        <w:spacing w:after="60"/>
-      </w:pPr>
-      <w:r>
-        <w:t xml:space="preserve">Définition d'un jeu de données de démonstration pour les tests et la soutenance.</w:t>
-      </w:r>
-    </w:p>
-    <w:p>
-      <w:pPr>
-        <w:spacing w:after="120"/>
-        <w:rPr>
-          <w:b/>
-          <w:bCs/>
-        </w:rPr>
-      </w:pPr>
-      <w:r>
-        <w:rPr>
-          <w:b/>
-          <w:bCs/>
-        </w:rPr>
-        <w:t xml:space="preserve">Compétences mises en œuvre :</w:t>
+        <w:spacing w:after="50"/>
+      </w:pPr>
+      <w:r>
+        <w:t xml:space="preserve">Mise en place de l'accès aux données via l'ORM SQLAlchemy, garantissant des requêtes préparées (protection contre les injections SQL).</w:t>
       </w:r>
     </w:p>
     <w:p>
@@ -1084,10 +1982,26 @@
           <w:ilvl w:val="0"/>
           <w:numId w:val="2"/>
         </w:numPr>
-        <w:spacing w:after="60"/>
-      </w:pPr>
-      <w:r>
-        <w:t xml:space="preserve">Concevoir une base de données.</w:t>
+        <w:spacing w:after="50"/>
+      </w:pPr>
+      <w:r>
+        <w:t xml:space="preserve">Création d'un jeu de données de démonstration pour les tests et la soutenance.</w:t>
+      </w:r>
+    </w:p>
+    <w:p>
+      <w:pPr>
+        <w:spacing w:after="120"/>
+        <w:rPr>
+          <w:b/>
+          <w:bCs/>
+        </w:rPr>
+      </w:pPr>
+      <w:r>
+        <w:rPr>
+          <w:b/>
+          <w:bCs/>
+        </w:rPr>
+        <w:t xml:space="preserve">Compétences mises en œuvre :</w:t>
       </w:r>
     </w:p>
     <w:p>
@@ -1097,10 +2011,10 @@
           <w:ilvl w:val="0"/>
           <w:numId w:val="2"/>
         </w:numPr>
-        <w:spacing w:after="60"/>
-      </w:pPr>
-      <w:r>
-        <w:t xml:space="preserve">Mettre en place une base de données.</w:t>
+        <w:spacing w:after="50"/>
+      </w:pPr>
+      <w:r>
+        <w:t xml:space="preserve">Concevoir une base de données.</w:t>
       </w:r>
     </w:p>
     <w:p>
@@ -1110,84 +2024,10 @@
           <w:ilvl w:val="0"/>
           <w:numId w:val="2"/>
         </w:numPr>
-        <w:spacing w:after="60"/>
-      </w:pPr>
-      <w:r>
-        <w:t xml:space="preserve">Développer des composants dans le langage d'une base de données.</w:t>
-      </w:r>
-    </w:p>
-    <w:p>
-      <w:pPr>
-        <w:spacing w:after="120"/>
-      </w:pPr>
-      <w:r>
-        <w:rPr>
-          <w:i/>
-          <w:iCs/>
-          <w:color w:val="B3267A"/>
-        </w:rPr>
-        <w:t xml:space="preserve">[À COMPLÉTER éventuellement : justifiez un choix de modélisation, par exemple la table solde_conge par employé / type / année.]</w:t>
-      </w:r>
-    </w:p>
-    <w:p>
-      <w:r>
-        <w:br w:type="page"/>
-      </w:r>
-    </w:p>
-    <w:p>
-      <w:pPr>
-        <w:pStyle w:val="Heading1"/>
-      </w:pPr>
-      <w:r>
-        <w:t xml:space="preserve">5. Activité-type 3 — Concevoir et développer une application multicouche sécurisée</w:t>
-      </w:r>
-    </w:p>
-    <w:p>
-      <w:pPr>
-        <w:pStyle w:val="Heading2"/>
-      </w:pPr>
-      <w:r>
-        <w:t xml:space="preserve">5.1 Exemple — Conception, développement et déploiement de l'application</w:t>
-      </w:r>
-    </w:p>
-    <w:p>
-      <w:pPr>
-        <w:spacing w:after="120"/>
-        <w:rPr>
-          <w:b/>
-          <w:bCs/>
-        </w:rPr>
-      </w:pPr>
-      <w:r>
-        <w:rPr>
-          <w:b/>
-          <w:bCs/>
-        </w:rPr>
-        <w:t xml:space="preserve">Contexte et description de la situation professionnelle :</w:t>
-      </w:r>
-    </w:p>
-    <w:p>
-      <w:pPr>
-        <w:spacing w:after="120"/>
-      </w:pPr>
-      <w:r>
-        <w:t xml:space="preserve">J'ai conçu et développé l'application complète selon une architecture en couches (présentation, API, métier, persistance), en intégrant la sécurité et la qualité logicielle à chaque étape, et en organisant le travail en mode agile.</w:t>
-      </w:r>
-    </w:p>
-    <w:p>
-      <w:pPr>
-        <w:spacing w:after="120"/>
-        <w:rPr>
-          <w:b/>
-          <w:bCs/>
-        </w:rPr>
-      </w:pPr>
-      <w:r>
-        <w:rPr>
-          <w:b/>
-          <w:bCs/>
-        </w:rPr>
-        <w:t xml:space="preserve">Actions réalisées :</w:t>
+        <w:spacing w:after="50"/>
+      </w:pPr>
+      <w:r>
+        <w:t xml:space="preserve">Mettre en place une base de données.</w:t>
       </w:r>
     </w:p>
     <w:p>
@@ -1197,10 +2037,654 @@
           <w:ilvl w:val="0"/>
           <w:numId w:val="2"/>
         </w:numPr>
-        <w:spacing w:after="60"/>
-      </w:pPr>
-      <w:r>
-        <w:t xml:space="preserve">Organisation agile : rédaction du backlog, des User Stories et priorisation MoSCoW.</w:t>
+        <w:spacing w:after="50"/>
+      </w:pPr>
+      <w:r>
+        <w:t xml:space="preserve">Développer des composants dans le langage d'une base de données.</w:t>
+      </w:r>
+    </w:p>
+    <w:p>
+      <w:pPr>
+        <w:pStyle w:val="Heading3"/>
+      </w:pPr>
+      <w:r>
+        <w:t xml:space="preserve">Réalisations techniques concrètes</w:t>
+      </w:r>
+    </w:p>
+    <w:p>
+      <w:pPr>
+        <w:spacing w:after="120"/>
+        <w:rPr>
+          <w:b/>
+          <w:bCs/>
+        </w:rPr>
+      </w:pPr>
+      <w:r>
+        <w:rPr>
+          <w:b/>
+          <w:bCs/>
+        </w:rPr>
+        <w:t xml:space="preserve">Définition des tables et des contraintes d'intégrité en SQL :</w:t>
+      </w:r>
+    </w:p>
+    <w:p>
+      <w:pPr>
+        <w:spacing w:after="40" w:before="60"/>
+      </w:pPr>
+      <w:r>
+        <w:rPr>
+          <w:b/>
+          <w:bCs/>
+          <w:color w:val="0B5394"/>
+          <w:sz w:val="18"/>
+          <w:szCs w:val="18"/>
+        </w:rPr>
+        <w:t xml:space="preserve">docs/sql/schema.sql (extrait)</w:t>
+      </w:r>
+    </w:p>
+    <w:tbl>
+      <w:tblPr>
+        <w:tblW w:type="dxa" w:w="9026"/>
+        <w:tblBorders>
+          <w:top w:val="single" w:color="auto" w:sz="4"/>
+          <w:left w:val="single" w:color="auto" w:sz="4"/>
+          <w:bottom w:val="single" w:color="auto" w:sz="4"/>
+          <w:right w:val="single" w:color="auto" w:sz="4"/>
+          <w:insideH w:val="single" w:color="auto" w:sz="4"/>
+          <w:insideV w:val="single" w:color="auto" w:sz="4"/>
+        </w:tblBorders>
+      </w:tblPr>
+      <w:tblGrid>
+        <w:gridCol w:w="9026"/>
+      </w:tblGrid>
+      <w:tr>
+        <w:tc>
+          <w:tcPr>
+            <w:tcW w:type="dxa" w:w="9026"/>
+            <w:tcBorders>
+              <w:top w:val="single" w:color="D6DEE6" w:sz="1"/>
+              <w:left w:val="single" w:color="0B5394" w:sz="4"/>
+              <w:bottom w:val="single" w:color="D6DEE6" w:sz="1"/>
+              <w:right w:val="single" w:color="D6DEE6" w:sz="1"/>
+            </w:tcBorders>
+            <w:shd w:fill="F6F8FA" w:val="clear"/>
+            <w:tcMar>
+              <w:top w:type="dxa" w:w="120"/>
+              <w:left w:type="dxa" w:w="160"/>
+              <w:bottom w:type="dxa" w:w="120"/>
+              <w:right w:type="dxa" w:w="120"/>
+            </w:tcMar>
+          </w:tcPr>
+          <w:p>
+            <w:pPr>
+              <w:spacing w:after="0" w:line="230" w:lineRule="auto"/>
+            </w:pPr>
+            <w:r>
+              <w:rPr>
+                <w:rFonts w:ascii="Courier New" w:cs="Courier New" w:eastAsia="Courier New" w:hAnsi="Courier New"/>
+                <w:color w:val="1B2A3A"/>
+                <w:sz w:val="16"/>
+                <w:szCs w:val="16"/>
+              </w:rPr>
+              <w:t xml:space="preserve">CREATE TABLE solde_conge (</w:t>
+            </w:r>
+          </w:p>
+          <w:p>
+            <w:pPr>
+              <w:spacing w:after="0" w:line="230" w:lineRule="auto"/>
+            </w:pPr>
+            <w:r>
+              <w:rPr>
+                <w:rFonts w:ascii="Courier New" w:cs="Courier New" w:eastAsia="Courier New" w:hAnsi="Courier New"/>
+                <w:color w:val="1B2A3A"/>
+                <w:sz w:val="16"/>
+                <w:szCs w:val="16"/>
+              </w:rPr>
+              <w:t xml:space="preserve">    id               SERIAL PRIMARY KEY,</w:t>
+            </w:r>
+          </w:p>
+          <w:p>
+            <w:pPr>
+              <w:spacing w:after="0" w:line="230" w:lineRule="auto"/>
+            </w:pPr>
+            <w:r>
+              <w:rPr>
+                <w:rFonts w:ascii="Courier New" w:cs="Courier New" w:eastAsia="Courier New" w:hAnsi="Courier New"/>
+                <w:color w:val="1B2A3A"/>
+                <w:sz w:val="16"/>
+                <w:szCs w:val="16"/>
+              </w:rPr>
+              <w:t xml:space="preserve">    employe_id       INTEGER NOT NULL REFERENCES employe(id),</w:t>
+            </w:r>
+          </w:p>
+          <w:p>
+            <w:pPr>
+              <w:spacing w:after="0" w:line="230" w:lineRule="auto"/>
+            </w:pPr>
+            <w:r>
+              <w:rPr>
+                <w:rFonts w:ascii="Courier New" w:cs="Courier New" w:eastAsia="Courier New" w:hAnsi="Courier New"/>
+                <w:color w:val="1B2A3A"/>
+                <w:sz w:val="16"/>
+                <w:szCs w:val="16"/>
+              </w:rPr>
+              <w:t xml:space="preserve">    type_absence_id  INTEGER NOT NULL REFERENCES type_absence(id),</w:t>
+            </w:r>
+          </w:p>
+          <w:p>
+            <w:pPr>
+              <w:spacing w:after="0" w:line="230" w:lineRule="auto"/>
+            </w:pPr>
+            <w:r>
+              <w:rPr>
+                <w:rFonts w:ascii="Courier New" w:cs="Courier New" w:eastAsia="Courier New" w:hAnsi="Courier New"/>
+                <w:color w:val="1B2A3A"/>
+                <w:sz w:val="16"/>
+                <w:szCs w:val="16"/>
+              </w:rPr>
+              <w:t xml:space="preserve">    annee            INTEGER NOT NULL,</w:t>
+            </w:r>
+          </w:p>
+          <w:p>
+            <w:pPr>
+              <w:spacing w:after="0" w:line="230" w:lineRule="auto"/>
+            </w:pPr>
+            <w:r>
+              <w:rPr>
+                <w:rFonts w:ascii="Courier New" w:cs="Courier New" w:eastAsia="Courier New" w:hAnsi="Courier New"/>
+                <w:color w:val="1B2A3A"/>
+                <w:sz w:val="16"/>
+                <w:szCs w:val="16"/>
+              </w:rPr>
+              <w:t xml:space="preserve">    jours_acquis     NUMERIC(5,1) NOT NULL DEFAULT 25.0</w:t>
+            </w:r>
+          </w:p>
+          <w:p>
+            <w:pPr>
+              <w:spacing w:after="0" w:line="230" w:lineRule="auto"/>
+            </w:pPr>
+            <w:r>
+              <w:rPr>
+                <w:rFonts w:ascii="Courier New" w:cs="Courier New" w:eastAsia="Courier New" w:hAnsi="Courier New"/>
+                <w:color w:val="1B2A3A"/>
+                <w:sz w:val="16"/>
+                <w:szCs w:val="16"/>
+              </w:rPr>
+              <w:t xml:space="preserve">                     CHECK (jours_acquis &gt;= 0),</w:t>
+            </w:r>
+          </w:p>
+          <w:p>
+            <w:pPr>
+              <w:spacing w:after="0" w:line="230" w:lineRule="auto"/>
+            </w:pPr>
+            <w:r>
+              <w:rPr>
+                <w:rFonts w:ascii="Courier New" w:cs="Courier New" w:eastAsia="Courier New" w:hAnsi="Courier New"/>
+                <w:color w:val="1B2A3A"/>
+                <w:sz w:val="16"/>
+                <w:szCs w:val="16"/>
+              </w:rPr>
+              <w:t xml:space="preserve">    jours_pris       NUMERIC(5,1) NOT NULL DEFAULT 0.0,</w:t>
+            </w:r>
+          </w:p>
+          <w:p>
+            <w:pPr>
+              <w:spacing w:after="0" w:line="230" w:lineRule="auto"/>
+            </w:pPr>
+            <w:r>
+              <w:rPr>
+                <w:rFonts w:ascii="Courier New" w:cs="Courier New" w:eastAsia="Courier New" w:hAnsi="Courier New"/>
+                <w:color w:val="1B2A3A"/>
+                <w:sz w:val="16"/>
+                <w:szCs w:val="16"/>
+              </w:rPr>
+              <w:t xml:space="preserve">    CONSTRAINT uq_solde UNIQUE (employe_id, type_absence_id, annee)</w:t>
+            </w:r>
+          </w:p>
+          <w:p>
+            <w:pPr>
+              <w:spacing w:after="0" w:line="230" w:lineRule="auto"/>
+            </w:pPr>
+            <w:r>
+              <w:rPr>
+                <w:rFonts w:ascii="Courier New" w:cs="Courier New" w:eastAsia="Courier New" w:hAnsi="Courier New"/>
+                <w:color w:val="1B2A3A"/>
+                <w:sz w:val="16"/>
+                <w:szCs w:val="16"/>
+              </w:rPr>
+              <w:t xml:space="preserve">);</w:t>
+            </w:r>
+          </w:p>
+        </w:tc>
+      </w:tr>
+    </w:tbl>
+    <w:p>
+      <w:pPr>
+        <w:spacing w:after="120"/>
+      </w:pPr>
+    </w:p>
+    <w:p>
+      <w:pPr>
+        <w:spacing w:after="120"/>
+        <w:rPr>
+          <w:b/>
+          <w:bCs/>
+        </w:rPr>
+      </w:pPr>
+      <w:r>
+        <w:rPr>
+          <w:b/>
+          <w:bCs/>
+        </w:rPr>
+        <w:t xml:space="preserve">Définition du modèle correspondant côté ORM (SQLAlchemy), qui produit des requêtes préparées :</w:t>
+      </w:r>
+    </w:p>
+    <w:p>
+      <w:pPr>
+        <w:spacing w:after="40" w:before="60"/>
+      </w:pPr>
+      <w:r>
+        <w:rPr>
+          <w:b/>
+          <w:bCs/>
+          <w:color w:val="0B5394"/>
+          <w:sz w:val="18"/>
+          <w:szCs w:val="18"/>
+        </w:rPr>
+        <w:t xml:space="preserve">backend/app/models.py (extrait)</w:t>
+      </w:r>
+    </w:p>
+    <w:tbl>
+      <w:tblPr>
+        <w:tblW w:type="dxa" w:w="9026"/>
+        <w:tblBorders>
+          <w:top w:val="single" w:color="auto" w:sz="4"/>
+          <w:left w:val="single" w:color="auto" w:sz="4"/>
+          <w:bottom w:val="single" w:color="auto" w:sz="4"/>
+          <w:right w:val="single" w:color="auto" w:sz="4"/>
+          <w:insideH w:val="single" w:color="auto" w:sz="4"/>
+          <w:insideV w:val="single" w:color="auto" w:sz="4"/>
+        </w:tblBorders>
+      </w:tblPr>
+      <w:tblGrid>
+        <w:gridCol w:w="9026"/>
+      </w:tblGrid>
+      <w:tr>
+        <w:tc>
+          <w:tcPr>
+            <w:tcW w:type="dxa" w:w="9026"/>
+            <w:tcBorders>
+              <w:top w:val="single" w:color="D6DEE6" w:sz="1"/>
+              <w:left w:val="single" w:color="0B5394" w:sz="4"/>
+              <w:bottom w:val="single" w:color="D6DEE6" w:sz="1"/>
+              <w:right w:val="single" w:color="D6DEE6" w:sz="1"/>
+            </w:tcBorders>
+            <w:shd w:fill="F6F8FA" w:val="clear"/>
+            <w:tcMar>
+              <w:top w:type="dxa" w:w="120"/>
+              <w:left w:type="dxa" w:w="160"/>
+              <w:bottom w:type="dxa" w:w="120"/>
+              <w:right w:type="dxa" w:w="120"/>
+            </w:tcMar>
+          </w:tcPr>
+          <w:p>
+            <w:pPr>
+              <w:spacing w:after="0" w:line="230" w:lineRule="auto"/>
+            </w:pPr>
+            <w:r>
+              <w:rPr>
+                <w:rFonts w:ascii="Courier New" w:cs="Courier New" w:eastAsia="Courier New" w:hAnsi="Courier New"/>
+                <w:color w:val="1B2A3A"/>
+                <w:sz w:val="16"/>
+                <w:szCs w:val="16"/>
+              </w:rPr>
+              <w:t xml:space="preserve">class SoldeConge(Base):</w:t>
+            </w:r>
+          </w:p>
+          <w:p>
+            <w:pPr>
+              <w:spacing w:after="0" w:line="230" w:lineRule="auto"/>
+            </w:pPr>
+            <w:r>
+              <w:rPr>
+                <w:rFonts w:ascii="Courier New" w:cs="Courier New" w:eastAsia="Courier New" w:hAnsi="Courier New"/>
+                <w:color w:val="1B2A3A"/>
+                <w:sz w:val="16"/>
+                <w:szCs w:val="16"/>
+              </w:rPr>
+              <w:t xml:space="preserve">    __tablename__ = "solde_conge"</w:t>
+            </w:r>
+          </w:p>
+          <w:p>
+            <w:pPr>
+              <w:spacing w:after="0" w:line="230" w:lineRule="auto"/>
+            </w:pPr>
+            <w:r>
+              <w:rPr>
+                <w:rFonts w:ascii="Courier New" w:cs="Courier New" w:eastAsia="Courier New" w:hAnsi="Courier New"/>
+                <w:color w:val="1B2A3A"/>
+                <w:sz w:val="16"/>
+                <w:szCs w:val="16"/>
+              </w:rPr>
+              <w:t xml:space="preserve">    id = mapped_column(Integer, primary_key=True)</w:t>
+            </w:r>
+          </w:p>
+          <w:p>
+            <w:pPr>
+              <w:spacing w:after="0" w:line="230" w:lineRule="auto"/>
+            </w:pPr>
+            <w:r>
+              <w:rPr>
+                <w:rFonts w:ascii="Courier New" w:cs="Courier New" w:eastAsia="Courier New" w:hAnsi="Courier New"/>
+                <w:color w:val="1B2A3A"/>
+                <w:sz w:val="16"/>
+                <w:szCs w:val="16"/>
+              </w:rPr>
+              <w:t xml:space="preserve">    employe_id = mapped_column(ForeignKey("employe.id"))</w:t>
+            </w:r>
+          </w:p>
+          <w:p>
+            <w:pPr>
+              <w:spacing w:after="0" w:line="230" w:lineRule="auto"/>
+            </w:pPr>
+            <w:r>
+              <w:rPr>
+                <w:rFonts w:ascii="Courier New" w:cs="Courier New" w:eastAsia="Courier New" w:hAnsi="Courier New"/>
+                <w:color w:val="1B2A3A"/>
+                <w:sz w:val="16"/>
+                <w:szCs w:val="16"/>
+              </w:rPr>
+              <w:t xml:space="preserve">    annee = mapped_column(Integer)</w:t>
+            </w:r>
+          </w:p>
+          <w:p>
+            <w:pPr>
+              <w:spacing w:after="0" w:line="230" w:lineRule="auto"/>
+            </w:pPr>
+            <w:r>
+              <w:rPr>
+                <w:rFonts w:ascii="Courier New" w:cs="Courier New" w:eastAsia="Courier New" w:hAnsi="Courier New"/>
+                <w:color w:val="1B2A3A"/>
+                <w:sz w:val="16"/>
+                <w:szCs w:val="16"/>
+              </w:rPr>
+              <w:t xml:space="preserve">    jours_acquis = mapped_column(default=25.0)</w:t>
+            </w:r>
+          </w:p>
+          <w:p>
+            <w:pPr>
+              <w:spacing w:after="0" w:line="230" w:lineRule="auto"/>
+            </w:pPr>
+            <w:r>
+              <w:rPr>
+                <w:rFonts w:ascii="Courier New" w:cs="Courier New" w:eastAsia="Courier New" w:hAnsi="Courier New"/>
+                <w:color w:val="1B2A3A"/>
+                <w:sz w:val="16"/>
+                <w:szCs w:val="16"/>
+              </w:rPr>
+              <w:t xml:space="preserve">    jours_pris = mapped_column(default=0.0)</w:t>
+            </w:r>
+          </w:p>
+          <w:p>
+            <w:pPr>
+              <w:spacing w:after="0" w:line="230" w:lineRule="auto"/>
+            </w:pPr>
+            <w:r>
+              <w:rPr>
+                <w:rFonts w:ascii="Courier New" w:cs="Courier New" w:eastAsia="Courier New" w:hAnsi="Courier New"/>
+                <w:color w:val="1B2A3A"/>
+                <w:sz w:val="16"/>
+                <w:szCs w:val="16"/>
+              </w:rPr>
+              <w:t xml:space="preserve"> </w:t>
+            </w:r>
+          </w:p>
+          <w:p>
+            <w:pPr>
+              <w:spacing w:after="0" w:line="230" w:lineRule="auto"/>
+            </w:pPr>
+            <w:r>
+              <w:rPr>
+                <w:rFonts w:ascii="Courier New" w:cs="Courier New" w:eastAsia="Courier New" w:hAnsi="Courier New"/>
+                <w:color w:val="1B2A3A"/>
+                <w:sz w:val="16"/>
+                <w:szCs w:val="16"/>
+              </w:rPr>
+              <w:t xml:space="preserve">    @property</w:t>
+            </w:r>
+          </w:p>
+          <w:p>
+            <w:pPr>
+              <w:spacing w:after="0" w:line="230" w:lineRule="auto"/>
+            </w:pPr>
+            <w:r>
+              <w:rPr>
+                <w:rFonts w:ascii="Courier New" w:cs="Courier New" w:eastAsia="Courier New" w:hAnsi="Courier New"/>
+                <w:color w:val="1B2A3A"/>
+                <w:sz w:val="16"/>
+                <w:szCs w:val="16"/>
+              </w:rPr>
+              <w:t xml:space="preserve">    def jours_restants(self) -&gt; float:</w:t>
+            </w:r>
+          </w:p>
+          <w:p>
+            <w:pPr>
+              <w:spacing w:after="0" w:line="230" w:lineRule="auto"/>
+            </w:pPr>
+            <w:r>
+              <w:rPr>
+                <w:rFonts w:ascii="Courier New" w:cs="Courier New" w:eastAsia="Courier New" w:hAnsi="Courier New"/>
+                <w:color w:val="1B2A3A"/>
+                <w:sz w:val="16"/>
+                <w:szCs w:val="16"/>
+              </w:rPr>
+              <w:t xml:space="preserve">        return self.jours_acquis - self.jours_pris</w:t>
+            </w:r>
+          </w:p>
+        </w:tc>
+      </w:tr>
+    </w:tbl>
+    <w:p>
+      <w:pPr>
+        <w:spacing w:after="120"/>
+      </w:pPr>
+    </w:p>
+    <w:p>
+      <w:pPr>
+        <w:spacing w:after="120"/>
+      </w:pPr>
+      <w:r>
+        <w:rPr>
+          <w:i/>
+          <w:iCs/>
+          <w:color w:val="B3267A"/>
+        </w:rPr>
+        <w:t xml:space="preserve">[À COMPLÉTER éventuellement : justifiez un choix de modélisation, par exemple un solde par employé / type / année.]</w:t>
+      </w:r>
+    </w:p>
+    <w:p>
+      <w:r>
+        <w:br w:type="page"/>
+      </w:r>
+    </w:p>
+    <w:p>
+      <w:pPr>
+        <w:pStyle w:val="Heading1"/>
+      </w:pPr>
+      <w:r>
+        <w:t xml:space="preserve">5. Activité-type 3 — Concevoir et développer une application multicouche sécurisée</w:t>
+      </w:r>
+    </w:p>
+    <w:p>
+      <w:pPr>
+        <w:spacing w:after="40" w:before="80"/>
+        <w:jc w:val="center"/>
+      </w:pPr>
+      <w:r>
+        <w:drawing>
+          <wp:inline distT="0" distB="0" distL="0" distR="0">
+            <wp:extent cx="3448050" cy="3048000"/>
+            <wp:effectExtent t="0" r="0" b="0" l="0"/>
+            <wp:docPr id="1" name="09-composants" descr="Diagramme de composants" title="Fig.9"/>
+            <wp:cNvGraphicFramePr>
+              <a:graphicFrameLocks xmlns:a="http://schemas.openxmlformats.org/drawingml/2006/main" noChangeAspect="1"/>
+            </wp:cNvGraphicFramePr>
+            <a:graphic xmlns:a="http://schemas.openxmlformats.org/drawingml/2006/main">
+              <a:graphicData uri="http://schemas.openxmlformats.org/drawingml/2006/picture">
+                <pic:pic xmlns:pic="http://schemas.openxmlformats.org/drawingml/2006/picture">
+                  <pic:nvPicPr>
+                    <pic:cNvPr id="0" name="" descr=""/>
+                    <pic:cNvPicPr>
+                      <a:picLocks noChangeAspect="1" noChangeArrowheads="1"/>
+                    </pic:cNvPicPr>
+                  </pic:nvPicPr>
+                  <pic:blipFill>
+                    <a:blip r:embed="rId11" cstate="none"/>
+                    <a:srcRect/>
+                    <a:stretch>
+                      <a:fillRect/>
+                    </a:stretch>
+                  </pic:blipFill>
+                  <pic:spPr bwMode="auto">
+                    <a:xfrm>
+                      <a:off x="0" y="0"/>
+                      <a:ext cx="3448050" cy="3048000"/>
+                    </a:xfrm>
+                    <a:prstGeom prst="rect">
+                      <a:avLst/>
+                    </a:prstGeom>
+                  </pic:spPr>
+                </pic:pic>
+              </a:graphicData>
+            </a:graphic>
+          </wp:inline>
+        </w:drawing>
+      </w:r>
+    </w:p>
+    <w:p>
+      <w:pPr>
+        <w:spacing w:after="140"/>
+        <w:jc w:val="center"/>
+      </w:pPr>
+      <w:r>
+        <w:rPr>
+          <w:i/>
+          <w:iCs/>
+          <w:color w:val="44505F"/>
+          <w:sz w:val="18"/>
+          <w:szCs w:val="18"/>
+        </w:rPr>
+        <w:t xml:space="preserve">Fig.9 — Diagramme de composants</w:t>
+      </w:r>
+    </w:p>
+    <w:p>
+      <w:pPr>
+        <w:spacing w:after="40" w:before="80"/>
+        <w:jc w:val="center"/>
+      </w:pPr>
+      <w:r>
+        <w:drawing>
+          <wp:inline distT="0" distB="0" distL="0" distR="0">
+            <wp:extent cx="1152525" cy="3048000"/>
+            <wp:effectExtent t="0" r="0" b="0" l="0"/>
+            <wp:docPr id="1" name="10-deploiement" descr="Diagramme de déploiement" title="Fig.10"/>
+            <wp:cNvGraphicFramePr>
+              <a:graphicFrameLocks xmlns:a="http://schemas.openxmlformats.org/drawingml/2006/main" noChangeAspect="1"/>
+            </wp:cNvGraphicFramePr>
+            <a:graphic xmlns:a="http://schemas.openxmlformats.org/drawingml/2006/main">
+              <a:graphicData uri="http://schemas.openxmlformats.org/drawingml/2006/picture">
+                <pic:pic xmlns:pic="http://schemas.openxmlformats.org/drawingml/2006/picture">
+                  <pic:nvPicPr>
+                    <pic:cNvPr id="0" name="" descr=""/>
+                    <pic:cNvPicPr>
+                      <a:picLocks noChangeAspect="1" noChangeArrowheads="1"/>
+                    </pic:cNvPicPr>
+                  </pic:nvPicPr>
+                  <pic:blipFill>
+                    <a:blip r:embed="rId12" cstate="none"/>
+                    <a:srcRect/>
+                    <a:stretch>
+                      <a:fillRect/>
+                    </a:stretch>
+                  </pic:blipFill>
+                  <pic:spPr bwMode="auto">
+                    <a:xfrm>
+                      <a:off x="0" y="0"/>
+                      <a:ext cx="1152525" cy="3048000"/>
+                    </a:xfrm>
+                    <a:prstGeom prst="rect">
+                      <a:avLst/>
+                    </a:prstGeom>
+                  </pic:spPr>
+                </pic:pic>
+              </a:graphicData>
+            </a:graphic>
+          </wp:inline>
+        </w:drawing>
+      </w:r>
+    </w:p>
+    <w:p>
+      <w:pPr>
+        <w:spacing w:after="140"/>
+        <w:jc w:val="center"/>
+      </w:pPr>
+      <w:r>
+        <w:rPr>
+          <w:i/>
+          <w:iCs/>
+          <w:color w:val="44505F"/>
+          <w:sz w:val="18"/>
+          <w:szCs w:val="18"/>
+        </w:rPr>
+        <w:t xml:space="preserve">Fig.10 — Diagramme de déploiement</w:t>
+      </w:r>
+    </w:p>
+    <w:p>
+      <w:pPr>
+        <w:pStyle w:val="Heading3"/>
+      </w:pPr>
+      <w:r>
+        <w:t xml:space="preserve">5.1 Exemple — Conception, développement et déploiement de l'application</w:t>
+      </w:r>
+    </w:p>
+    <w:p>
+      <w:pPr>
+        <w:spacing w:after="120"/>
+        <w:rPr>
+          <w:b/>
+          <w:bCs/>
+        </w:rPr>
+      </w:pPr>
+      <w:r>
+        <w:rPr>
+          <w:b/>
+          <w:bCs/>
+        </w:rPr>
+        <w:t xml:space="preserve">Contexte et description de la situation professionnelle :</w:t>
+      </w:r>
+    </w:p>
+    <w:p>
+      <w:pPr>
+        <w:spacing w:after="120"/>
+      </w:pPr>
+      <w:r>
+        <w:t xml:space="preserve">J'ai conçu et développé l'application complète selon une architecture en couches (présentation, API, métier, persistance), en intégrant la sécurité et la qualité logicielle à chaque étape, et en organisant le travail en mode agile.</w:t>
+      </w:r>
+    </w:p>
+    <w:p>
+      <w:pPr>
+        <w:spacing w:after="120"/>
+        <w:rPr>
+          <w:b/>
+          <w:bCs/>
+        </w:rPr>
+      </w:pPr>
+      <w:r>
+        <w:rPr>
+          <w:b/>
+          <w:bCs/>
+        </w:rPr>
+        <w:t xml:space="preserve">Actions réalisées :</w:t>
       </w:r>
     </w:p>
     <w:p>
@@ -1210,10 +2694,10 @@
           <w:ilvl w:val="0"/>
           <w:numId w:val="2"/>
         </w:numPr>
-        <w:spacing w:after="60"/>
-      </w:pPr>
-      <w:r>
-        <w:t xml:space="preserve">Conception : diagrammes UML (cas d'utilisation, séquence, classes, état-transition, composants, déploiement).</w:t>
+        <w:spacing w:after="50"/>
+      </w:pPr>
+      <w:r>
+        <w:t xml:space="preserve">Organisation agile : rédaction du backlog, des User Stories et priorisation MoSCoW.</w:t>
       </w:r>
     </w:p>
     <w:p>
@@ -1223,10 +2707,10 @@
           <w:ilvl w:val="0"/>
           <w:numId w:val="2"/>
         </w:numPr>
-        <w:spacing w:after="60"/>
-      </w:pPr>
-      <w:r>
-        <w:t xml:space="preserve">Développement de l'API REST avec FastAPI : authentification JWT, autorisations par rôle (RBAC), logique métier isolée et testable (calcul des jours ouvrés, contrôle des soldes, machine à états des demandes).</w:t>
+        <w:spacing w:after="50"/>
+      </w:pPr>
+      <w:r>
+        <w:t xml:space="preserve">Conception : diagrammes UML (contexte, cas d'utilisation, séquence, classes, état-transition, composants, déploiement).</w:t>
       </w:r>
     </w:p>
     <w:p>
@@ -1236,10 +2720,10 @@
           <w:ilvl w:val="0"/>
           <w:numId w:val="2"/>
         </w:numPr>
-        <w:spacing w:after="60"/>
-      </w:pPr>
-      <w:r>
-        <w:t xml:space="preserve">Sécurité : hachage bcrypt des mots de passe, CORS restreint, validation des entrées, prise en compte de l'OWASP Top 10.</w:t>
+        <w:spacing w:after="50"/>
+      </w:pPr>
+      <w:r>
+        <w:t xml:space="preserve">Développement de l'API REST avec FastAPI : authentification JWT, autorisations par rôle (RBAC).</w:t>
       </w:r>
     </w:p>
     <w:p>
@@ -1249,10 +2733,10 @@
           <w:ilvl w:val="0"/>
           <w:numId w:val="2"/>
         </w:numPr>
-        <w:spacing w:after="60"/>
-      </w:pPr>
-      <w:r>
-        <w:t xml:space="preserve">Qualité : tests unitaires et d'intégration (pytest), tests front (Vitest).</w:t>
+        <w:spacing w:after="50"/>
+      </w:pPr>
+      <w:r>
+        <w:t xml:space="preserve">Développement de la logique métier isolée et testable (jours ouvrés, soldes, machine à états des demandes).</w:t>
       </w:r>
     </w:p>
     <w:p>
@@ -1262,26 +2746,10 @@
           <w:ilvl w:val="0"/>
           <w:numId w:val="2"/>
         </w:numPr>
-        <w:spacing w:after="60"/>
-      </w:pPr>
-      <w:r>
-        <w:t xml:space="preserve">Déploiement : conteneurisation Docker (front, back, base) et intégration continue via GitHub Actions.</w:t>
-      </w:r>
-    </w:p>
-    <w:p>
-      <w:pPr>
-        <w:spacing w:after="120"/>
-        <w:rPr>
-          <w:b/>
-          <w:bCs/>
-        </w:rPr>
-      </w:pPr>
-      <w:r>
-        <w:rPr>
-          <w:b/>
-          <w:bCs/>
-        </w:rPr>
-        <w:t xml:space="preserve">Compétences mises en œuvre :</w:t>
+        <w:spacing w:after="50"/>
+      </w:pPr>
+      <w:r>
+        <w:t xml:space="preserve">Sécurité : hachage bcrypt des mots de passe, CORS restreint, validation des entrées, prise en compte de l'OWASP Top 10.</w:t>
       </w:r>
     </w:p>
     <w:p>
@@ -1291,10 +2759,10 @@
           <w:ilvl w:val="0"/>
           <w:numId w:val="2"/>
         </w:numPr>
-        <w:spacing w:after="60"/>
-      </w:pPr>
-      <w:r>
-        <w:t xml:space="preserve">Collaborer à la gestion d'un projet informatique et à l'organisation de l'environnement de développement.</w:t>
+        <w:spacing w:after="50"/>
+      </w:pPr>
+      <w:r>
+        <w:t xml:space="preserve">Qualité : 21 tests automatisés (pytest, Vitest), tous au vert.</w:t>
       </w:r>
     </w:p>
     <w:p>
@@ -1304,10 +2772,26 @@
           <w:ilvl w:val="0"/>
           <w:numId w:val="2"/>
         </w:numPr>
-        <w:spacing w:after="60"/>
-      </w:pPr>
-      <w:r>
-        <w:t xml:space="preserve">Concevoir une application.</w:t>
+        <w:spacing w:after="50"/>
+      </w:pPr>
+      <w:r>
+        <w:t xml:space="preserve">Déploiement : conteneurisation Docker (front, back, base) et intégration continue via GitHub Actions.</w:t>
+      </w:r>
+    </w:p>
+    <w:p>
+      <w:pPr>
+        <w:spacing w:after="120"/>
+        <w:rPr>
+          <w:b/>
+          <w:bCs/>
+        </w:rPr>
+      </w:pPr>
+      <w:r>
+        <w:rPr>
+          <w:b/>
+          <w:bCs/>
+        </w:rPr>
+        <w:t xml:space="preserve">Compétences mises en œuvre :</w:t>
       </w:r>
     </w:p>
     <w:p>
@@ -1317,10 +2801,10 @@
           <w:ilvl w:val="0"/>
           <w:numId w:val="2"/>
         </w:numPr>
-        <w:spacing w:after="60"/>
-      </w:pPr>
-      <w:r>
-        <w:t xml:space="preserve">Développer des composants métier côté serveur.</w:t>
+        <w:spacing w:after="50"/>
+      </w:pPr>
+      <w:r>
+        <w:t xml:space="preserve">Collaborer à la gestion d'un projet informatique et à l'organisation de l'environnement de développement.</w:t>
       </w:r>
     </w:p>
     <w:p>
@@ -1330,10 +2814,10 @@
           <w:ilvl w:val="0"/>
           <w:numId w:val="2"/>
         </w:numPr>
-        <w:spacing w:after="60"/>
-      </w:pPr>
-      <w:r>
-        <w:t xml:space="preserve">Construire une application organisée en couches.</w:t>
+        <w:spacing w:after="50"/>
+      </w:pPr>
+      <w:r>
+        <w:t xml:space="preserve">Concevoir une application.</w:t>
       </w:r>
     </w:p>
     <w:p>
@@ -1343,10 +2827,10 @@
           <w:ilvl w:val="0"/>
           <w:numId w:val="2"/>
         </w:numPr>
-        <w:spacing w:after="60"/>
-      </w:pPr>
-      <w:r>
-        <w:t xml:space="preserve">Préparer et exécuter les plans de tests d'une application.</w:t>
+        <w:spacing w:after="50"/>
+      </w:pPr>
+      <w:r>
+        <w:t xml:space="preserve">Développer des composants métier côté serveur.</w:t>
       </w:r>
     </w:p>
     <w:p>
@@ -1356,86 +2840,10 @@
           <w:ilvl w:val="0"/>
           <w:numId w:val="2"/>
         </w:numPr>
-        <w:spacing w:after="60"/>
-      </w:pPr>
-      <w:r>
-        <w:t xml:space="preserve">Préparer et documenter le déploiement d'une application.</w:t>
-      </w:r>
-    </w:p>
-    <w:p>
-      <w:pPr>
-        <w:spacing w:after="120"/>
-      </w:pPr>
-      <w:r>
-        <w:rPr>
-          <w:i/>
-          <w:iCs/>
-          <w:color w:val="B3267A"/>
-        </w:rPr>
-        <w:t xml:space="preserve">[À COMPLÉTER éventuellement : décrivez la mise en place de la machine à états des demandes et son intérêt pour la cohérence métier.]</w:t>
-      </w:r>
-    </w:p>
-    <w:p>
-      <w:r>
-        <w:br w:type="page"/>
-      </w:r>
-    </w:p>
-    <w:p>
-      <w:pPr>
-        <w:pStyle w:val="Heading1"/>
-      </w:pPr>
-      <w:r>
-        <w:t xml:space="preserve">6. Titres, diplômes et annexes</w:t>
-      </w:r>
-    </w:p>
-    <w:p>
-      <w:pPr>
-        <w:pStyle w:val="Heading2"/>
-      </w:pPr>
-      <w:r>
-        <w:t xml:space="preserve">Titres et diplômes</w:t>
-      </w:r>
-    </w:p>
-    <w:p>
-      <w:pPr>
-        <w:spacing w:after="120"/>
-      </w:pPr>
-      <w:r>
-        <w:rPr>
-          <w:i/>
-          <w:iCs/>
-          <w:color w:val="B3267A"/>
-        </w:rPr>
-        <w:t xml:space="preserve">[À COMPLÉTER : listez vos diplômes et certifications éventuels.]</w:t>
-      </w:r>
-    </w:p>
-    <w:p>
-      <w:pPr>
-        <w:pStyle w:val="Heading2"/>
-      </w:pPr>
-      <w:r>
-        <w:t xml:space="preserve">Curriculum Vitae</w:t>
-      </w:r>
-    </w:p>
-    <w:p>
-      <w:pPr>
-        <w:spacing w:after="120"/>
-      </w:pPr>
-      <w:r>
-        <w:rPr>
-          <w:i/>
-          <w:iCs/>
-          <w:color w:val="B3267A"/>
-        </w:rPr>
-        <w:t xml:space="preserve">[À COMPLÉTER : joindre votre CV.]</w:t>
-      </w:r>
-    </w:p>
-    <w:p>
-      <w:pPr>
-        <w:pStyle w:val="Heading2"/>
-      </w:pPr>
-      <w:r>
-        <w:t xml:space="preserve">Annexes techniques</w:t>
+        <w:spacing w:after="50"/>
+      </w:pPr>
+      <w:r>
+        <w:t xml:space="preserve">Construire une application organisée en couches.</w:t>
       </w:r>
     </w:p>
     <w:p>
@@ -1445,10 +2853,10 @@
           <w:ilvl w:val="0"/>
           <w:numId w:val="2"/>
         </w:numPr>
-        <w:spacing w:after="60"/>
-      </w:pPr>
-      <w:r>
-        <w:t xml:space="preserve">Dépôt GitHub du projet : [lien].</w:t>
+        <w:spacing w:after="50"/>
+      </w:pPr>
+      <w:r>
+        <w:t xml:space="preserve">Préparer et exécuter les plans de tests d'une application.</w:t>
       </w:r>
     </w:p>
     <w:p>
@@ -1458,10 +2866,364 @@
           <w:ilvl w:val="0"/>
           <w:numId w:val="2"/>
         </w:numPr>
-        <w:spacing w:after="60"/>
-      </w:pPr>
-      <w:r>
-        <w:t xml:space="preserve">Dossier Projet complet (mémoire) joint séparément.</w:t>
+        <w:spacing w:after="50"/>
+      </w:pPr>
+      <w:r>
+        <w:t xml:space="preserve">Préparer et documenter le déploiement d'une application.</w:t>
+      </w:r>
+    </w:p>
+    <w:p>
+      <w:pPr>
+        <w:pStyle w:val="Heading3"/>
+      </w:pPr>
+      <w:r>
+        <w:t xml:space="preserve">Réalisations techniques concrètes</w:t>
+      </w:r>
+    </w:p>
+    <w:p>
+      <w:pPr>
+        <w:spacing w:after="120"/>
+        <w:rPr>
+          <w:b/>
+          <w:bCs/>
+        </w:rPr>
+      </w:pPr>
+      <w:r>
+        <w:rPr>
+          <w:b/>
+          <w:bCs/>
+        </w:rPr>
+        <w:t xml:space="preserve">Contrôle d'accès par rôle au niveau de l'API (RBAC) :</w:t>
+      </w:r>
+    </w:p>
+    <w:p>
+      <w:pPr>
+        <w:spacing w:after="40" w:before="60"/>
+      </w:pPr>
+      <w:r>
+        <w:rPr>
+          <w:b/>
+          <w:bCs/>
+          <w:color w:val="0B5394"/>
+          <w:sz w:val="18"/>
+          <w:szCs w:val="18"/>
+        </w:rPr>
+        <w:t xml:space="preserve">backend/app/deps.py (extrait)</w:t>
+      </w:r>
+    </w:p>
+    <w:tbl>
+      <w:tblPr>
+        <w:tblW w:type="dxa" w:w="9026"/>
+        <w:tblBorders>
+          <w:top w:val="single" w:color="auto" w:sz="4"/>
+          <w:left w:val="single" w:color="auto" w:sz="4"/>
+          <w:bottom w:val="single" w:color="auto" w:sz="4"/>
+          <w:right w:val="single" w:color="auto" w:sz="4"/>
+          <w:insideH w:val="single" w:color="auto" w:sz="4"/>
+          <w:insideV w:val="single" w:color="auto" w:sz="4"/>
+        </w:tblBorders>
+      </w:tblPr>
+      <w:tblGrid>
+        <w:gridCol w:w="9026"/>
+      </w:tblGrid>
+      <w:tr>
+        <w:tc>
+          <w:tcPr>
+            <w:tcW w:type="dxa" w:w="9026"/>
+            <w:tcBorders>
+              <w:top w:val="single" w:color="D6DEE6" w:sz="1"/>
+              <w:left w:val="single" w:color="0B5394" w:sz="4"/>
+              <w:bottom w:val="single" w:color="D6DEE6" w:sz="1"/>
+              <w:right w:val="single" w:color="D6DEE6" w:sz="1"/>
+            </w:tcBorders>
+            <w:shd w:fill="F6F8FA" w:val="clear"/>
+            <w:tcMar>
+              <w:top w:type="dxa" w:w="120"/>
+              <w:left w:type="dxa" w:w="160"/>
+              <w:bottom w:type="dxa" w:w="120"/>
+              <w:right w:type="dxa" w:w="120"/>
+            </w:tcMar>
+          </w:tcPr>
+          <w:p>
+            <w:pPr>
+              <w:spacing w:after="0" w:line="230" w:lineRule="auto"/>
+            </w:pPr>
+            <w:r>
+              <w:rPr>
+                <w:rFonts w:ascii="Courier New" w:cs="Courier New" w:eastAsia="Courier New" w:hAnsi="Courier New"/>
+                <w:color w:val="1B2A3A"/>
+                <w:sz w:val="16"/>
+                <w:szCs w:val="16"/>
+              </w:rPr>
+              <w:t xml:space="preserve">def exiger_roles(*roles: Role):</w:t>
+            </w:r>
+          </w:p>
+          <w:p>
+            <w:pPr>
+              <w:spacing w:after="0" w:line="230" w:lineRule="auto"/>
+            </w:pPr>
+            <w:r>
+              <w:rPr>
+                <w:rFonts w:ascii="Courier New" w:cs="Courier New" w:eastAsia="Courier New" w:hAnsi="Courier New"/>
+                <w:color w:val="1B2A3A"/>
+                <w:sz w:val="16"/>
+                <w:szCs w:val="16"/>
+              </w:rPr>
+              <w:t xml:space="preserve">    def verificateur(user = Depends(get_current_user)):</w:t>
+            </w:r>
+          </w:p>
+          <w:p>
+            <w:pPr>
+              <w:spacing w:after="0" w:line="230" w:lineRule="auto"/>
+            </w:pPr>
+            <w:r>
+              <w:rPr>
+                <w:rFonts w:ascii="Courier New" w:cs="Courier New" w:eastAsia="Courier New" w:hAnsi="Courier New"/>
+                <w:color w:val="1B2A3A"/>
+                <w:sz w:val="16"/>
+                <w:szCs w:val="16"/>
+              </w:rPr>
+              <w:t xml:space="preserve">        if user.role not in roles:</w:t>
+            </w:r>
+          </w:p>
+          <w:p>
+            <w:pPr>
+              <w:spacing w:after="0" w:line="230" w:lineRule="auto"/>
+            </w:pPr>
+            <w:r>
+              <w:rPr>
+                <w:rFonts w:ascii="Courier New" w:cs="Courier New" w:eastAsia="Courier New" w:hAnsi="Courier New"/>
+                <w:color w:val="1B2A3A"/>
+                <w:sz w:val="16"/>
+                <w:szCs w:val="16"/>
+              </w:rPr>
+              <w:t xml:space="preserve">            raise HTTPException(403, "Accès refusé : rôle insuffisant")</w:t>
+            </w:r>
+          </w:p>
+          <w:p>
+            <w:pPr>
+              <w:spacing w:after="0" w:line="230" w:lineRule="auto"/>
+            </w:pPr>
+            <w:r>
+              <w:rPr>
+                <w:rFonts w:ascii="Courier New" w:cs="Courier New" w:eastAsia="Courier New" w:hAnsi="Courier New"/>
+                <w:color w:val="1B2A3A"/>
+                <w:sz w:val="16"/>
+                <w:szCs w:val="16"/>
+              </w:rPr>
+              <w:t xml:space="preserve">        return user</w:t>
+            </w:r>
+          </w:p>
+          <w:p>
+            <w:pPr>
+              <w:spacing w:after="0" w:line="230" w:lineRule="auto"/>
+            </w:pPr>
+            <w:r>
+              <w:rPr>
+                <w:rFonts w:ascii="Courier New" w:cs="Courier New" w:eastAsia="Courier New" w:hAnsi="Courier New"/>
+                <w:color w:val="1B2A3A"/>
+                <w:sz w:val="16"/>
+                <w:szCs w:val="16"/>
+              </w:rPr>
+              <w:t xml:space="preserve">    return verificateur</w:t>
+            </w:r>
+          </w:p>
+        </w:tc>
+      </w:tr>
+    </w:tbl>
+    <w:p>
+      <w:pPr>
+        <w:spacing w:after="120"/>
+      </w:pPr>
+    </w:p>
+    <w:p>
+      <w:pPr>
+        <w:spacing w:after="120"/>
+        <w:rPr>
+          <w:b/>
+          <w:bCs/>
+        </w:rPr>
+      </w:pPr>
+      <w:r>
+        <w:rPr>
+          <w:b/>
+          <w:bCs/>
+        </w:rPr>
+        <w:t xml:space="preserve">Démarrage de l'ensemble de l'application en conteneurs, et exécution des tests :</w:t>
+      </w:r>
+    </w:p>
+    <w:p>
+      <w:pPr>
+        <w:spacing w:after="40" w:before="60"/>
+      </w:pPr>
+      <w:r>
+        <w:rPr>
+          <w:b/>
+          <w:bCs/>
+          <w:color w:val="0B5394"/>
+          <w:sz w:val="18"/>
+          <w:szCs w:val="18"/>
+        </w:rPr>
+        <w:t xml:space="preserve">Terminal — déploiement et tests</w:t>
+      </w:r>
+    </w:p>
+    <w:tbl>
+      <w:tblPr>
+        <w:tblW w:type="dxa" w:w="9026"/>
+        <w:tblBorders>
+          <w:top w:val="single" w:color="auto" w:sz="4"/>
+          <w:left w:val="single" w:color="auto" w:sz="4"/>
+          <w:bottom w:val="single" w:color="auto" w:sz="4"/>
+          <w:right w:val="single" w:color="auto" w:sz="4"/>
+          <w:insideH w:val="single" w:color="auto" w:sz="4"/>
+          <w:insideV w:val="single" w:color="auto" w:sz="4"/>
+        </w:tblBorders>
+      </w:tblPr>
+      <w:tblGrid>
+        <w:gridCol w:w="9026"/>
+      </w:tblGrid>
+      <w:tr>
+        <w:tc>
+          <w:tcPr>
+            <w:tcW w:type="dxa" w:w="9026"/>
+            <w:tcBorders>
+              <w:top w:val="single" w:color="D6DEE6" w:sz="1"/>
+              <w:left w:val="single" w:color="0B5394" w:sz="4"/>
+              <w:bottom w:val="single" w:color="D6DEE6" w:sz="1"/>
+              <w:right w:val="single" w:color="D6DEE6" w:sz="1"/>
+            </w:tcBorders>
+            <w:shd w:fill="F6F8FA" w:val="clear"/>
+            <w:tcMar>
+              <w:top w:type="dxa" w:w="120"/>
+              <w:left w:type="dxa" w:w="160"/>
+              <w:bottom w:type="dxa" w:w="120"/>
+              <w:right w:type="dxa" w:w="120"/>
+            </w:tcMar>
+          </w:tcPr>
+          <w:p>
+            <w:pPr>
+              <w:spacing w:after="0" w:line="230" w:lineRule="auto"/>
+            </w:pPr>
+            <w:r>
+              <w:rPr>
+                <w:rFonts w:ascii="Courier New" w:cs="Courier New" w:eastAsia="Courier New" w:hAnsi="Courier New"/>
+                <w:color w:val="1B2A3A"/>
+                <w:sz w:val="16"/>
+                <w:szCs w:val="16"/>
+              </w:rPr>
+              <w:t xml:space="preserve">docker compose up --build     # db + backend + frontend</w:t>
+            </w:r>
+          </w:p>
+          <w:p>
+            <w:pPr>
+              <w:spacing w:after="0" w:line="230" w:lineRule="auto"/>
+            </w:pPr>
+            <w:r>
+              <w:rPr>
+                <w:rFonts w:ascii="Courier New" w:cs="Courier New" w:eastAsia="Courier New" w:hAnsi="Courier New"/>
+                <w:color w:val="1B2A3A"/>
+                <w:sz w:val="16"/>
+                <w:szCs w:val="16"/>
+              </w:rPr>
+              <w:t xml:space="preserve">cd backend &amp;&amp; pytest -q       # 19 tests back-end</w:t>
+            </w:r>
+          </w:p>
+          <w:p>
+            <w:pPr>
+              <w:spacing w:after="0" w:line="230" w:lineRule="auto"/>
+            </w:pPr>
+            <w:r>
+              <w:rPr>
+                <w:rFonts w:ascii="Courier New" w:cs="Courier New" w:eastAsia="Courier New" w:hAnsi="Courier New"/>
+                <w:color w:val="1B2A3A"/>
+                <w:sz w:val="16"/>
+                <w:szCs w:val="16"/>
+              </w:rPr>
+              <w:t xml:space="preserve">cd frontend &amp;&amp; npm test       # 2 tests front-end</w:t>
+            </w:r>
+          </w:p>
+        </w:tc>
+      </w:tr>
+    </w:tbl>
+    <w:p>
+      <w:pPr>
+        <w:spacing w:after="120"/>
+      </w:pPr>
+    </w:p>
+    <w:p>
+      <w:pPr>
+        <w:spacing w:after="120"/>
+      </w:pPr>
+      <w:r>
+        <w:rPr>
+          <w:i/>
+          <w:iCs/>
+          <w:color w:val="B3267A"/>
+        </w:rPr>
+        <w:t xml:space="preserve">[À COMPLÉTER éventuellement : décrivez la mise en place de la machine à états des demandes et son intérêt pour la cohérence métier.]</w:t>
+      </w:r>
+    </w:p>
+    <w:p>
+      <w:r>
+        <w:br w:type="page"/>
+      </w:r>
+    </w:p>
+    <w:p>
+      <w:pPr>
+        <w:pStyle w:val="Heading1"/>
+      </w:pPr>
+      <w:r>
+        <w:t xml:space="preserve">6. Titres, diplômes et annexes</w:t>
+      </w:r>
+    </w:p>
+    <w:p>
+      <w:pPr>
+        <w:pStyle w:val="Heading2"/>
+      </w:pPr>
+      <w:r>
+        <w:t xml:space="preserve">Titres et diplômes</w:t>
+      </w:r>
+    </w:p>
+    <w:p>
+      <w:pPr>
+        <w:spacing w:after="120"/>
+      </w:pPr>
+      <w:r>
+        <w:rPr>
+          <w:i/>
+          <w:iCs/>
+          <w:color w:val="B3267A"/>
+        </w:rPr>
+        <w:t xml:space="preserve">[À COMPLÉTER : listez vos diplômes et certifications éventuels.]</w:t>
+      </w:r>
+    </w:p>
+    <w:p>
+      <w:pPr>
+        <w:pStyle w:val="Heading2"/>
+      </w:pPr>
+      <w:r>
+        <w:t xml:space="preserve">Curriculum Vitae</w:t>
+      </w:r>
+    </w:p>
+    <w:p>
+      <w:pPr>
+        <w:spacing w:after="120"/>
+      </w:pPr>
+      <w:r>
+        <w:rPr>
+          <w:i/>
+          <w:iCs/>
+          <w:color w:val="B3267A"/>
+        </w:rPr>
+        <w:t xml:space="preserve">[À COMPLÉTER : joindre votre CV.]</w:t>
+      </w:r>
+    </w:p>
+    <w:p>
+      <w:pPr>
+        <w:pStyle w:val="Heading2"/>
+      </w:pPr>
+      <w:r>
+        <w:t xml:space="preserve">Annexes techniques</w:t>
       </w:r>
     </w:p>
     <w:p>
@@ -1471,7 +3233,33 @@
           <w:ilvl w:val="0"/>
           <w:numId w:val="2"/>
         </w:numPr>
-        <w:spacing w:after="60"/>
+        <w:spacing w:after="50"/>
+      </w:pPr>
+      <w:r>
+        <w:t xml:space="preserve">Dépôt GitHub du projet : [lien].</w:t>
+      </w:r>
+    </w:p>
+    <w:p>
+      <w:pPr>
+        <w:pStyle w:val="ListParagraph"/>
+        <w:numPr>
+          <w:ilvl w:val="0"/>
+          <w:numId w:val="2"/>
+        </w:numPr>
+        <w:spacing w:after="50"/>
+      </w:pPr>
+      <w:r>
+        <w:t xml:space="preserve">Dossier Projet complet (mémoire) joint séparément.</w:t>
+      </w:r>
+    </w:p>
+    <w:p>
+      <w:pPr>
+        <w:pStyle w:val="ListParagraph"/>
+        <w:numPr>
+          <w:ilvl w:val="0"/>
+          <w:numId w:val="2"/>
+        </w:numPr>
+        <w:spacing w:after="50"/>
       </w:pPr>
       <w:r>
         <w:t xml:space="preserve">Diagrammes, scripts SQL et documentation d'API dans le dépôt (dossier docs/).</w:t>
@@ -1898,7 +3686,7 @@
     <w:qFormat/>
     <w:pPr>
       <w:pBdr>
-        <w:bottom w:val="single" w:color="2F59C2" w:sz="6" w:space="4"/>
+        <w:bottom w:val="single" w:color="0B5394" w:sz="6" w:space="4"/>
       </w:pBdr>
       <w:spacing w:after="140" w:before="240"/>
       <w:outlineLvl w:val="0"/>
@@ -1923,10 +3711,27 @@
     <w:rPr>
       <w:b/>
       <w:bCs/>
-      <w:color w:val="2F59C2"/>
+      <w:color w:val="0B5394"/>
       <w:sz w:val="24"/>
       <w:szCs w:val="24"/>
     </w:rPr>
   </w:style>
+  <w:style w:type="paragraph" w:styleId="Heading3">
+    <w:name w:val="Heading 3"/>
+    <w:basedOn w:val="Normal"/>
+    <w:next w:val="Normal"/>
+    <w:qFormat/>
+    <w:pPr>
+      <w:spacing w:after="80" w:before="160"/>
+      <w:outlineLvl w:val="2"/>
+    </w:pPr>
+    <w:rPr>
+      <w:b/>
+      <w:bCs/>
+      <w:color w:val="44505F"/>
+      <w:sz w:val="22"/>
+      <w:szCs w:val="22"/>
+    </w:rPr>
+  </w:style>
 </w:styles>
 </file>
</xml_diff>

<commit_message>
Livrables : captures de l'application en ligne et liens (app + GitHub)
- 5 captures de l'app déployée (connexion, espace salarié, validation
  manager, tableau de bord, Swagger) dans docs/screenshots/.
- Mémoire : captures intégrées (Fig.13 à 17) + URL app et GitHub.
- PowerPoint : slide démo avec captures réelles + liens.
- DP : liens dépôt GitHub et application en ligne.
</commit_message>
<xml_diff>
--- a/livrables/Dossier_Professionnel_CDA.docx
+++ b/livrables/Dossier_Professionnel_CDA.docx
@@ -3236,7 +3236,20 @@
         <w:spacing w:after="50"/>
       </w:pPr>
       <w:r>
-        <w:t xml:space="preserve">Dépôt GitHub du projet : [lien].</w:t>
+        <w:t xml:space="preserve">Dépôt GitHub du projet : https://github.com/glo007/congesflow</w:t>
+      </w:r>
+    </w:p>
+    <w:p>
+      <w:pPr>
+        <w:pStyle w:val="ListParagraph"/>
+        <w:numPr>
+          <w:ilvl w:val="0"/>
+          <w:numId w:val="2"/>
+        </w:numPr>
+        <w:spacing w:after="50"/>
+      </w:pPr>
+      <w:r>
+        <w:t xml:space="preserve">Application déployée en ligne : https://congesflow-web.onrender.com</w:t>
       </w:r>
     </w:p>
     <w:p>

</xml_diff>

<commit_message>
Documents : complète les sections de contenu (perf, veille, difficultés, parcours DP)
</commit_message>
<xml_diff>
--- a/livrables/Dossier_Professionnel_CDA.docx
+++ b/livrables/Dossier_Professionnel_CDA.docx
@@ -486,12 +486,7 @@
         <w:spacing w:after="120"/>
       </w:pPr>
       <w:r>
-        <w:rPr>
-          <w:i/>
-          <w:iCs/>
-          <w:color w:val="B3267A"/>
-        </w:rPr>
-        <w:t xml:space="preserve">[À COMPLÉTER : présentez votre parcours, votre projet professionnel et le contexte de réalisation du projet — formation à l'ESTIAM, éventuel stage ou alternance.]</w:t>
+        <w:t xml:space="preserve">Dans le cadre de ma formation de Concepteur Développeur d'Applications à l'ESTIAM, j'ai réalisé le projet CongésFlow comme projet de fin d'études. Ce projet m'a permis de mettre en pratique l'ensemble des compétences acquises durant la formation, de la conception jusqu'à la mise en production en ligne. Il illustre mon projet professionnel : concevoir et développer des applications web complètes, sécurisées et déployées, en maîtrisant aussi bien le front-end que le back-end et les pratiques de qualité (tests, intégration continue, conteneurisation).</w:t>
       </w:r>
     </w:p>
     <w:p>
@@ -1743,12 +1738,7 @@
         <w:spacing w:after="120"/>
       </w:pPr>
       <w:r>
-        <w:rPr>
-          <w:i/>
-          <w:iCs/>
-          <w:color w:val="B3267A"/>
-        </w:rPr>
-        <w:t xml:space="preserve">[À COMPLÉTER éventuellement : ajoutez une difficulté concrète rencontrée sur le front et la manière dont vous l'avez résolue.]</w:t>
+        <w:t xml:space="preserve">Difficulté rencontrée : la communication entre le front-end (port 5173) et l'API (port 8000) était bloquée par la politique de sécurité CORS du navigateur. Je l'ai résolue en configurant un middleware CORS côté serveur autorisant l'origine du front, puis, lors du déploiement en ligne, en élargissant la règle aux domaines de l'hébergeur.</w:t>
       </w:r>
     </w:p>
     <w:p>
@@ -2494,12 +2484,7 @@
         <w:spacing w:after="120"/>
       </w:pPr>
       <w:r>
-        <w:rPr>
-          <w:i/>
-          <w:iCs/>
-          <w:color w:val="B3267A"/>
-        </w:rPr>
-        <w:t xml:space="preserve">[À COMPLÉTER éventuellement : justifiez un choix de modélisation, par exemple un solde par employé / type / année.]</w:t>
+        <w:t xml:space="preserve">Choix de modélisation : le solde de congés est identifié par la combinaison employé / type d'absence / année. Ce choix permet de gérer plusieurs types de congés (congés payés, RTT…) indépendamment, de conserver l'historique année par année, et de garantir l'unicité de chaque solde grâce à une contrainte UNIQUE portant sur ces trois colonnes.</w:t>
       </w:r>
     </w:p>
     <w:p>
@@ -3155,12 +3140,7 @@
         <w:spacing w:after="120"/>
       </w:pPr>
       <w:r>
-        <w:rPr>
-          <w:i/>
-          <w:iCs/>
-          <w:color w:val="B3267A"/>
-        </w:rPr>
-        <w:t xml:space="preserve">[À COMPLÉTER éventuellement : décrivez la mise en place de la machine à états des demandes et son intérêt pour la cohérence métier.]</w:t>
+        <w:t xml:space="preserve">Mise en place de la machine à états : le statut d'une demande ne peut évoluer que selon des transitions autorisées (SOUMISE → VALIDÉE / REFUSÉE / ANNULÉE, et VALIDÉE → ANNULÉE). Centraliser ces règles dans une fonction dédiée garantit la cohérence métier : il devient impossible, par exemple, de valider une demande déjà refusée, et toute transition interdite renvoie une erreur 409. C'est un point fort du projet en matière de fiabilité.</w:t>
       </w:r>
     </w:p>
     <w:p>

</xml_diff>

<commit_message>
Documents : complète les sections (perf, veille, difficultés, parcours DP), nom de l'étudiant partout, et ajoute les diagrammes d'activité/séquence par cas d'utilisation (retour encadrant)
</commit_message>
<xml_diff>
--- a/livrables/Dossier_Professionnel_CDA.docx
+++ b/livrables/Dossier_Professionnel_CDA.docx
@@ -3221,35 +3221,45 @@
     <w:p>
       <w:pPr>
         <w:spacing w:after="120"/>
-      </w:pPr>
-      <w:r>
         <w:rPr>
           <w:i/>
           <w:iCs/>
-          <w:color w:val="B3267A"/>
-        </w:rPr>
-        <w:t xml:space="preserve">[À COMPLÉTER : listez vos diplômes et certifications éventuels.]</w:t>
-      </w:r>
-    </w:p>
-    <w:p>
-      <w:pPr>
-        <w:pStyle w:val="Heading2"/>
-      </w:pPr>
-      <w:r>
-        <w:t xml:space="preserve">Curriculum Vitae</w:t>
-      </w:r>
-    </w:p>
-    <w:p>
-      <w:pPr>
-        <w:spacing w:after="120"/>
+          <w:color w:val="6B7785"/>
+        </w:rPr>
       </w:pPr>
       <w:r>
         <w:rPr>
           <w:i/>
           <w:iCs/>
-          <w:color w:val="B3267A"/>
-        </w:rPr>
-        <w:t xml:space="preserve">[À COMPLÉTER : joindre votre CV.]</w:t>
+          <w:color w:val="6B7785"/>
+        </w:rPr>
+        <w:t xml:space="preserve">Section facultative — à renseigner si vous détenez des titres, diplômes ou certifications professionnelles que vous souhaitez porter à la connaissance du jury.</w:t>
+      </w:r>
+    </w:p>
+    <w:p>
+      <w:pPr>
+        <w:pStyle w:val="Heading2"/>
+      </w:pPr>
+      <w:r>
+        <w:t xml:space="preserve">Curriculum Vitae</w:t>
+      </w:r>
+    </w:p>
+    <w:p>
+      <w:pPr>
+        <w:spacing w:after="120"/>
+        <w:rPr>
+          <w:i/>
+          <w:iCs/>
+          <w:color w:val="6B7785"/>
+        </w:rPr>
+      </w:pPr>
+      <w:r>
+        <w:rPr>
+          <w:i/>
+          <w:iCs/>
+          <w:color w:val="6B7785"/>
+        </w:rPr>
+        <w:t xml:space="preserve">Section facultative — un curriculum vitae peut être joint au dossier.</w:t>
       </w:r>
     </w:p>
     <w:p>

</xml_diff>